<commit_message>
actualizacion documento evidencia personal Sebastian Carrera
</commit_message>
<xml_diff>
--- a/Fase 2/Evidencias Individuales/Carrera_Sebastian_2.1_APT122_DiarioReflexionFase2 - copia.docx
+++ b/Fase 2/Evidencias Individuales/Carrera_Sebastian_2.1_APT122_DiarioReflexionFase2 - copia.docx
@@ -1,6 +1,6 @@
 
 <file path=word/document.xml><?xml version="1.0" encoding="utf-8"?>
-<w:document xmlns:wpc="http://schemas.microsoft.com/office/word/2010/wordprocessingCanvas" xmlns:cx="http://schemas.microsoft.com/office/drawing/2014/chartex" xmlns:mc="http://schemas.openxmlformats.org/markup-compatibility/2006" xmlns:o="urn:schemas-microsoft-com:office:office" xmlns:r="http://schemas.openxmlformats.org/officeDocument/2006/relationships" xmlns:m="http://schemas.openxmlformats.org/officeDocument/2006/math" xmlns:v="urn:schemas-microsoft-com:vml" xmlns:wp14="http://schemas.microsoft.com/office/word/2010/wordprocessingDrawing" xmlns:wp="http://schemas.openxmlformats.org/drawingml/2006/wordprocessingDrawing" xmlns:w10="urn:schemas-microsoft-com:office:word" xmlns:w="http://schemas.openxmlformats.org/wordprocessingml/2006/main" xmlns:w14="http://schemas.microsoft.com/office/word/2010/wordml" xmlns:w15="http://schemas.microsoft.com/office/word/2012/wordml" xmlns:w16se="http://schemas.microsoft.com/office/word/2015/wordml/symex" xmlns:wpg="http://schemas.microsoft.com/office/word/2010/wordprocessingGroup" xmlns:wpi="http://schemas.microsoft.com/office/word/2010/wordprocessingInk" xmlns:wne="http://schemas.microsoft.com/office/word/2006/wordml" xmlns:wps="http://schemas.microsoft.com/office/word/2010/wordprocessingShape" mc:Ignorable="w14 w15 w16se wp14">
+<w:document xmlns:wpc="http://schemas.microsoft.com/office/word/2010/wordprocessingCanvas" xmlns:cx="http://schemas.microsoft.com/office/drawing/2014/chartex" xmlns:cx1="http://schemas.microsoft.com/office/drawing/2015/9/8/chartex" xmlns:cx2="http://schemas.microsoft.com/office/drawing/2015/10/21/chartex" xmlns:cx3="http://schemas.microsoft.com/office/drawing/2016/5/9/chartex" xmlns:cx4="http://schemas.microsoft.com/office/drawing/2016/5/10/chartex" xmlns:cx5="http://schemas.microsoft.com/office/drawing/2016/5/11/chartex" xmlns:cx6="http://schemas.microsoft.com/office/drawing/2016/5/12/chartex" xmlns:cx7="http://schemas.microsoft.com/office/drawing/2016/5/13/chartex" xmlns:cx8="http://schemas.microsoft.com/office/drawing/2016/5/14/chartex" xmlns:mc="http://schemas.openxmlformats.org/markup-compatibility/2006" xmlns:aink="http://schemas.microsoft.com/office/drawing/2016/ink" xmlns:am3d="http://schemas.microsoft.com/office/drawing/2017/model3d" xmlns:o="urn:schemas-microsoft-com:office:office" xmlns:oel="http://schemas.microsoft.com/office/2019/extlst" xmlns:r="http://schemas.openxmlformats.org/officeDocument/2006/relationships" xmlns:m="http://schemas.openxmlformats.org/officeDocument/2006/math" xmlns:v="urn:schemas-microsoft-com:vml" xmlns:wp14="http://schemas.microsoft.com/office/word/2010/wordprocessingDrawing" xmlns:wp="http://schemas.openxmlformats.org/drawingml/2006/wordprocessingDrawing" xmlns:w10="urn:schemas-microsoft-com:office:word" xmlns:w="http://schemas.openxmlformats.org/wordprocessingml/2006/main" xmlns:w14="http://schemas.microsoft.com/office/word/2010/wordml" xmlns:w15="http://schemas.microsoft.com/office/word/2012/wordml" xmlns:w16cex="http://schemas.microsoft.com/office/word/2018/wordml/cex" xmlns:w16cid="http://schemas.microsoft.com/office/word/2016/wordml/cid" xmlns:w16="http://schemas.microsoft.com/office/word/2018/wordml" xmlns:w16du="http://schemas.microsoft.com/office/word/2023/wordml/word16du" xmlns:w16sdtdh="http://schemas.microsoft.com/office/word/2020/wordml/sdtdatahash" xmlns:w16sdtfl="http://schemas.microsoft.com/office/word/2024/wordml/sdtformatlock" xmlns:w16se="http://schemas.microsoft.com/office/word/2015/wordml/symex" xmlns:wpg="http://schemas.microsoft.com/office/word/2010/wordprocessingGroup" xmlns:wpi="http://schemas.microsoft.com/office/word/2010/wordprocessingInk" xmlns:wne="http://schemas.microsoft.com/office/word/2006/wordml" xmlns:wps="http://schemas.microsoft.com/office/word/2010/wordprocessingShape" mc:Ignorable="w14 w15 w16se w16cid w16 w16cex w16sdtdh w16sdtfl w16du wp14">
   <w:body>
     <w:p/>
     <w:tbl>
@@ -341,6 +341,15 @@
                 <w:color w:val="1F4E79" w:themeColor="accent1" w:themeShade="80"/>
               </w:rPr>
             </w:pPr>
+            <w:r>
+              <w:rPr>
+                <w:rFonts w:ascii="Calibri" w:hAnsi="Calibri"/>
+                <w:b/>
+                <w:bCs/>
+                <w:color w:val="1F4E79" w:themeColor="accent1" w:themeShade="80"/>
+              </w:rPr>
+              <w:t>Aún no ha sido posible cumplir al 100% con las actividades propuestas en la carta Gantt, se me ha dificultado por estar realizando la práctica profesional, por lo que mis horas para programar en el día se acortan considerablemente. La inteligencia artificial me ha facilitado bastante el trabajo, me ayuda a complementar ciertas cosas que quizás no había visto previamente.</w:t>
+            </w:r>
           </w:p>
           <w:p>
             <w:pPr>
@@ -477,6 +486,15 @@
                 <w:color w:val="1F4E79" w:themeColor="accent1" w:themeShade="80"/>
               </w:rPr>
             </w:pPr>
+            <w:r>
+              <w:rPr>
+                <w:rFonts w:ascii="Calibri" w:hAnsi="Calibri"/>
+                <w:b/>
+                <w:bCs/>
+                <w:color w:val="1F4E79" w:themeColor="accent1" w:themeShade="80"/>
+              </w:rPr>
+              <w:t>De momento me encuentro buscando la forma de cumplir con los objetivos principales del proyecto, como lo es el escaneo de productos, el sistema de inventario, una interfaz intuitiva y los agregados que queremos implementar para darle valor al proyecto, al final de mi práctica podré organizar mejor el código, documentar y asegurarme que todo lo utilizado con el proyecto cumple con su funcionalidad.</w:t>
+            </w:r>
           </w:p>
           <w:p>
             <w:pPr>
@@ -685,7 +703,6 @@
                 <w:sz w:val="24"/>
                 <w:szCs w:val="24"/>
               </w:rPr>
-              <w:lastRenderedPageBreak/>
               <w:t>¿Cómo evalúas tu</w:t>
             </w:r>
             <w:r>
@@ -731,6 +748,15 @@
                 <w:color w:val="1F4E79" w:themeColor="accent1" w:themeShade="80"/>
               </w:rPr>
             </w:pPr>
+            <w:r>
+              <w:rPr>
+                <w:rFonts w:ascii="Calibri" w:hAnsi="Calibri"/>
+                <w:b/>
+                <w:bCs/>
+                <w:color w:val="1F4E79" w:themeColor="accent1" w:themeShade="80"/>
+              </w:rPr>
+              <w:t>De momento yo creo que he trabajado bien, mi trabajo ha sido decente, pero me gustaría mejorar más en el orden. A veces dejo código donde no debería y daño la estructura ordenada que queremos darle al proyecto, algo que podría hacer es fijarme bien y comentar más cada cosa que añado.</w:t>
+            </w:r>
           </w:p>
           <w:p>
             <w:pPr>
@@ -868,6 +894,15 @@
                 <w:color w:val="1F4E79" w:themeColor="accent1" w:themeShade="80"/>
               </w:rPr>
             </w:pPr>
+            <w:r>
+              <w:rPr>
+                <w:rFonts w:ascii="Calibri" w:hAnsi="Calibri"/>
+                <w:b/>
+                <w:bCs/>
+                <w:color w:val="1F4E79" w:themeColor="accent1" w:themeShade="80"/>
+              </w:rPr>
+              <w:t>De momento no tengo muchas inquietudes respecto al proyecto, mi mayor inquietud es el funcionamiento del sistema utilizado en el negocio del cliente, por temas de tiempo no he sido capaz de ver su funcionamiento y por ello aun no puedo idear una forma clara para realizar la implementación que tenemos planificada.</w:t>
+            </w:r>
           </w:p>
           <w:p>
             <w:pPr>
@@ -1021,12 +1056,21 @@
             <w:pPr>
               <w:jc w:val="both"/>
               <w:rPr>
-                <w:rFonts w:eastAsiaTheme="majorEastAsia"/>
-                <w:color w:val="767171" w:themeColor="background2" w:themeShade="80"/>
-                <w:sz w:val="24"/>
-                <w:szCs w:val="24"/>
+                <w:rFonts w:ascii="Calibri" w:hAnsi="Calibri"/>
+                <w:b/>
+                <w:bCs/>
+                <w:color w:val="1F4E79" w:themeColor="accent1" w:themeShade="80"/>
               </w:rPr>
             </w:pPr>
+            <w:r>
+              <w:rPr>
+                <w:rFonts w:ascii="Calibri" w:hAnsi="Calibri"/>
+                <w:b/>
+                <w:bCs/>
+                <w:color w:val="1F4E79" w:themeColor="accent1" w:themeShade="80"/>
+              </w:rPr>
+              <w:t>Considero que las actividades están bien asignadas, aunque si a veces requerimos el apoyo del compañero para poder cumplir con los objetivos semanales del cronograma. No hay nuevas tareas de momento.</w:t>
+            </w:r>
           </w:p>
           <w:p>
             <w:pPr>
@@ -1141,8 +1185,6 @@
               </w:rPr>
               <w:t>. APT  grupal</w:t>
             </w:r>
-            <w:bookmarkStart w:id="0" w:name="_GoBack"/>
-            <w:bookmarkEnd w:id="0"/>
           </w:p>
         </w:tc>
       </w:tr>
@@ -1172,6 +1214,7 @@
                 <w:sz w:val="24"/>
                 <w:szCs w:val="24"/>
               </w:rPr>
+              <w:lastRenderedPageBreak/>
               <w:t>¿Cómo evalúan el trabajo en grupo? ¿Qué aspectos positivos destacan? ¿Qué aspectos podrían mejorar?</w:t>
             </w:r>
           </w:p>
@@ -1196,6 +1239,15 @@
                 <w:szCs w:val="24"/>
               </w:rPr>
             </w:pPr>
+            <w:r>
+              <w:rPr>
+                <w:rFonts w:eastAsiaTheme="majorEastAsia"/>
+                <w:color w:val="767171" w:themeColor="background2" w:themeShade="80"/>
+                <w:sz w:val="24"/>
+                <w:szCs w:val="24"/>
+              </w:rPr>
+              <w:t>Considero que el trabajo en grupo es excelente, siempre hay comunicación con mi compañera y hay apoyo a pesar de que las actividades tienen un responsable designado siempre se aporta sin importar los responsables. De momento podríamos mejorar el orden de los archivos, que orden hay en cada documento y que tareas hay que realizar, considero que las actividades tienen títulos muy generales y quizás al momento de desarrollar surgen nuevas necesidades en el proyecto, lo que obliga a realizar cambios en etapas anteriores, principalmente en la base de datos.</w:t>
+            </w:r>
           </w:p>
           <w:p>
             <w:pPr>
@@ -1272,7 +1324,7 @@
 </file>
 
 <file path=word/endnotes.xml><?xml version="1.0" encoding="utf-8"?>
-<w:endnotes xmlns:wpc="http://schemas.microsoft.com/office/word/2010/wordprocessingCanvas" xmlns:cx="http://schemas.microsoft.com/office/drawing/2014/chartex" xmlns:mc="http://schemas.openxmlformats.org/markup-compatibility/2006" xmlns:o="urn:schemas-microsoft-com:office:office" xmlns:r="http://schemas.openxmlformats.org/officeDocument/2006/relationships" xmlns:m="http://schemas.openxmlformats.org/officeDocument/2006/math" xmlns:v="urn:schemas-microsoft-com:vml" xmlns:wp14="http://schemas.microsoft.com/office/word/2010/wordprocessingDrawing" xmlns:wp="http://schemas.openxmlformats.org/drawingml/2006/wordprocessingDrawing" xmlns:w10="urn:schemas-microsoft-com:office:word" xmlns:w="http://schemas.openxmlformats.org/wordprocessingml/2006/main" xmlns:w14="http://schemas.microsoft.com/office/word/2010/wordml" xmlns:w15="http://schemas.microsoft.com/office/word/2012/wordml" xmlns:w16se="http://schemas.microsoft.com/office/word/2015/wordml/symex" xmlns:wpg="http://schemas.microsoft.com/office/word/2010/wordprocessingGroup" xmlns:wpi="http://schemas.microsoft.com/office/word/2010/wordprocessingInk" xmlns:wne="http://schemas.microsoft.com/office/word/2006/wordml" xmlns:wps="http://schemas.microsoft.com/office/word/2010/wordprocessingShape" mc:Ignorable="w14 w15 w16se wp14">
+<w:endnotes xmlns:wpc="http://schemas.microsoft.com/office/word/2010/wordprocessingCanvas" xmlns:cx="http://schemas.microsoft.com/office/drawing/2014/chartex" xmlns:cx1="http://schemas.microsoft.com/office/drawing/2015/9/8/chartex" xmlns:cx2="http://schemas.microsoft.com/office/drawing/2015/10/21/chartex" xmlns:cx3="http://schemas.microsoft.com/office/drawing/2016/5/9/chartex" xmlns:cx4="http://schemas.microsoft.com/office/drawing/2016/5/10/chartex" xmlns:cx5="http://schemas.microsoft.com/office/drawing/2016/5/11/chartex" xmlns:cx6="http://schemas.microsoft.com/office/drawing/2016/5/12/chartex" xmlns:cx7="http://schemas.microsoft.com/office/drawing/2016/5/13/chartex" xmlns:cx8="http://schemas.microsoft.com/office/drawing/2016/5/14/chartex" xmlns:mc="http://schemas.openxmlformats.org/markup-compatibility/2006" xmlns:aink="http://schemas.microsoft.com/office/drawing/2016/ink" xmlns:am3d="http://schemas.microsoft.com/office/drawing/2017/model3d" xmlns:o="urn:schemas-microsoft-com:office:office" xmlns:oel="http://schemas.microsoft.com/office/2019/extlst" xmlns:r="http://schemas.openxmlformats.org/officeDocument/2006/relationships" xmlns:m="http://schemas.openxmlformats.org/officeDocument/2006/math" xmlns:v="urn:schemas-microsoft-com:vml" xmlns:wp14="http://schemas.microsoft.com/office/word/2010/wordprocessingDrawing" xmlns:wp="http://schemas.openxmlformats.org/drawingml/2006/wordprocessingDrawing" xmlns:w10="urn:schemas-microsoft-com:office:word" xmlns:w="http://schemas.openxmlformats.org/wordprocessingml/2006/main" xmlns:w14="http://schemas.microsoft.com/office/word/2010/wordml" xmlns:w15="http://schemas.microsoft.com/office/word/2012/wordml" xmlns:w16cex="http://schemas.microsoft.com/office/word/2018/wordml/cex" xmlns:w16cid="http://schemas.microsoft.com/office/word/2016/wordml/cid" xmlns:w16="http://schemas.microsoft.com/office/word/2018/wordml" xmlns:w16du="http://schemas.microsoft.com/office/word/2023/wordml/word16du" xmlns:w16sdtdh="http://schemas.microsoft.com/office/word/2020/wordml/sdtdatahash" xmlns:w16sdtfl="http://schemas.microsoft.com/office/word/2024/wordml/sdtformatlock" xmlns:w16se="http://schemas.microsoft.com/office/word/2015/wordml/symex" xmlns:wpg="http://schemas.microsoft.com/office/word/2010/wordprocessingGroup" xmlns:wpi="http://schemas.microsoft.com/office/word/2010/wordprocessingInk" xmlns:wne="http://schemas.microsoft.com/office/word/2006/wordml" xmlns:wps="http://schemas.microsoft.com/office/word/2010/wordprocessingShape" mc:Ignorable="w14 w15 w16se w16cid w16 w16cex w16sdtdh w16sdtfl w16du wp14">
   <w:endnote w:type="separator" w:id="-1">
     <w:p>
       <w:pPr>
@@ -1297,7 +1349,7 @@
 </file>
 
 <file path=word/footer1.xml><?xml version="1.0" encoding="utf-8"?>
-<w:ftr xmlns:wpc="http://schemas.microsoft.com/office/word/2010/wordprocessingCanvas" xmlns:cx="http://schemas.microsoft.com/office/drawing/2014/chartex" xmlns:mc="http://schemas.openxmlformats.org/markup-compatibility/2006" xmlns:o="urn:schemas-microsoft-com:office:office" xmlns:r="http://schemas.openxmlformats.org/officeDocument/2006/relationships" xmlns:m="http://schemas.openxmlformats.org/officeDocument/2006/math" xmlns:v="urn:schemas-microsoft-com:vml" xmlns:wp14="http://schemas.microsoft.com/office/word/2010/wordprocessingDrawing" xmlns:wp="http://schemas.openxmlformats.org/drawingml/2006/wordprocessingDrawing" xmlns:w10="urn:schemas-microsoft-com:office:word" xmlns:w="http://schemas.openxmlformats.org/wordprocessingml/2006/main" xmlns:w14="http://schemas.microsoft.com/office/word/2010/wordml" xmlns:w15="http://schemas.microsoft.com/office/word/2012/wordml" xmlns:w16se="http://schemas.microsoft.com/office/word/2015/wordml/symex" xmlns:wpg="http://schemas.microsoft.com/office/word/2010/wordprocessingGroup" xmlns:wpi="http://schemas.microsoft.com/office/word/2010/wordprocessingInk" xmlns:wne="http://schemas.microsoft.com/office/word/2006/wordml" xmlns:wps="http://schemas.microsoft.com/office/word/2010/wordprocessingShape" mc:Ignorable="w14 w15 w16se wp14">
+<w:ftr xmlns:wpc="http://schemas.microsoft.com/office/word/2010/wordprocessingCanvas" xmlns:cx="http://schemas.microsoft.com/office/drawing/2014/chartex" xmlns:cx1="http://schemas.microsoft.com/office/drawing/2015/9/8/chartex" xmlns:cx2="http://schemas.microsoft.com/office/drawing/2015/10/21/chartex" xmlns:cx3="http://schemas.microsoft.com/office/drawing/2016/5/9/chartex" xmlns:cx4="http://schemas.microsoft.com/office/drawing/2016/5/10/chartex" xmlns:cx5="http://schemas.microsoft.com/office/drawing/2016/5/11/chartex" xmlns:cx6="http://schemas.microsoft.com/office/drawing/2016/5/12/chartex" xmlns:cx7="http://schemas.microsoft.com/office/drawing/2016/5/13/chartex" xmlns:cx8="http://schemas.microsoft.com/office/drawing/2016/5/14/chartex" xmlns:mc="http://schemas.openxmlformats.org/markup-compatibility/2006" xmlns:aink="http://schemas.microsoft.com/office/drawing/2016/ink" xmlns:am3d="http://schemas.microsoft.com/office/drawing/2017/model3d" xmlns:o="urn:schemas-microsoft-com:office:office" xmlns:oel="http://schemas.microsoft.com/office/2019/extlst" xmlns:r="http://schemas.openxmlformats.org/officeDocument/2006/relationships" xmlns:m="http://schemas.openxmlformats.org/officeDocument/2006/math" xmlns:v="urn:schemas-microsoft-com:vml" xmlns:wp14="http://schemas.microsoft.com/office/word/2010/wordprocessingDrawing" xmlns:wp="http://schemas.openxmlformats.org/drawingml/2006/wordprocessingDrawing" xmlns:w10="urn:schemas-microsoft-com:office:word" xmlns:w="http://schemas.openxmlformats.org/wordprocessingml/2006/main" xmlns:w14="http://schemas.microsoft.com/office/word/2010/wordml" xmlns:w15="http://schemas.microsoft.com/office/word/2012/wordml" xmlns:w16cex="http://schemas.microsoft.com/office/word/2018/wordml/cex" xmlns:w16cid="http://schemas.microsoft.com/office/word/2016/wordml/cid" xmlns:w16="http://schemas.microsoft.com/office/word/2018/wordml" xmlns:w16du="http://schemas.microsoft.com/office/word/2023/wordml/word16du" xmlns:w16sdtdh="http://schemas.microsoft.com/office/word/2020/wordml/sdtdatahash" xmlns:w16sdtfl="http://schemas.microsoft.com/office/word/2024/wordml/sdtformatlock" xmlns:w16se="http://schemas.microsoft.com/office/word/2015/wordml/symex" xmlns:wpg="http://schemas.microsoft.com/office/word/2010/wordprocessingGroup" xmlns:wpi="http://schemas.microsoft.com/office/word/2010/wordprocessingInk" xmlns:wne="http://schemas.microsoft.com/office/word/2006/wordml" xmlns:wps="http://schemas.microsoft.com/office/word/2010/wordprocessingShape" mc:Ignorable="w14 w15 w16se w16cid w16 w16cex w16sdtdh w16sdtfl w16du wp14">
   <w:sdt>
     <w:sdtPr>
       <w:id w:val="-937982979"/>
@@ -1306,7 +1358,6 @@
         <w:docPartUnique/>
       </w:docPartObj>
     </w:sdtPr>
-    <w:sdtEndPr/>
     <w:sdtContent>
       <w:p>
         <w:pPr>
@@ -1518,7 +1569,7 @@
             </mc:Choice>
             <mc:Fallback>
               <w:pict>
-                <v:group w14:anchorId="51D00065" id="Grupo 32" o:spid="_x0000_s1026" style="position:absolute;margin-left:0;margin-top:0;width:610.5pt;height:15pt;z-index:251659264;mso-width-percent:1000;mso-position-horizontal:center;mso-position-horizontal-relative:page;mso-position-vertical:center;mso-position-vertical-relative:bottom-margin-area;mso-width-percent:1000" coordorigin=",14970" coordsize="12255,300" o:gfxdata="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">
+                <v:group w14:anchorId="51D00065" id="Grupo 32" o:spid="_x0000_s1026" style="position:absolute;margin-left:0;margin-top:0;width:610.5pt;height:15pt;z-index:251659264;mso-width-percent:1000;mso-position-horizontal:center;mso-position-horizontal-relative:page;mso-position-vertical:center;mso-position-vertical-relative:bottom-margin-area;mso-width-percent:1000" coordorigin=",14970" coordsize="12255,300" o:gfxdata="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">
                   <v:shapetype id="_x0000_t202" coordsize="21600,21600" o:spt="202" path="m,l,21600r21600,l21600,xe">
                     <v:stroke joinstyle="miter"/>
                     <v:path gradientshapeok="t" o:connecttype="rect"/>
@@ -1585,7 +1636,7 @@
 </file>
 
 <file path=word/footnotes.xml><?xml version="1.0" encoding="utf-8"?>
-<w:footnotes xmlns:wpc="http://schemas.microsoft.com/office/word/2010/wordprocessingCanvas" xmlns:cx="http://schemas.microsoft.com/office/drawing/2014/chartex" xmlns:mc="http://schemas.openxmlformats.org/markup-compatibility/2006" xmlns:o="urn:schemas-microsoft-com:office:office" xmlns:r="http://schemas.openxmlformats.org/officeDocument/2006/relationships" xmlns:m="http://schemas.openxmlformats.org/officeDocument/2006/math" xmlns:v="urn:schemas-microsoft-com:vml" xmlns:wp14="http://schemas.microsoft.com/office/word/2010/wordprocessingDrawing" xmlns:wp="http://schemas.openxmlformats.org/drawingml/2006/wordprocessingDrawing" xmlns:w10="urn:schemas-microsoft-com:office:word" xmlns:w="http://schemas.openxmlformats.org/wordprocessingml/2006/main" xmlns:w14="http://schemas.microsoft.com/office/word/2010/wordml" xmlns:w15="http://schemas.microsoft.com/office/word/2012/wordml" xmlns:w16se="http://schemas.microsoft.com/office/word/2015/wordml/symex" xmlns:wpg="http://schemas.microsoft.com/office/word/2010/wordprocessingGroup" xmlns:wpi="http://schemas.microsoft.com/office/word/2010/wordprocessingInk" xmlns:wne="http://schemas.microsoft.com/office/word/2006/wordml" xmlns:wps="http://schemas.microsoft.com/office/word/2010/wordprocessingShape" mc:Ignorable="w14 w15 w16se wp14">
+<w:footnotes xmlns:wpc="http://schemas.microsoft.com/office/word/2010/wordprocessingCanvas" xmlns:cx="http://schemas.microsoft.com/office/drawing/2014/chartex" xmlns:cx1="http://schemas.microsoft.com/office/drawing/2015/9/8/chartex" xmlns:cx2="http://schemas.microsoft.com/office/drawing/2015/10/21/chartex" xmlns:cx3="http://schemas.microsoft.com/office/drawing/2016/5/9/chartex" xmlns:cx4="http://schemas.microsoft.com/office/drawing/2016/5/10/chartex" xmlns:cx5="http://schemas.microsoft.com/office/drawing/2016/5/11/chartex" xmlns:cx6="http://schemas.microsoft.com/office/drawing/2016/5/12/chartex" xmlns:cx7="http://schemas.microsoft.com/office/drawing/2016/5/13/chartex" xmlns:cx8="http://schemas.microsoft.com/office/drawing/2016/5/14/chartex" xmlns:mc="http://schemas.openxmlformats.org/markup-compatibility/2006" xmlns:aink="http://schemas.microsoft.com/office/drawing/2016/ink" xmlns:am3d="http://schemas.microsoft.com/office/drawing/2017/model3d" xmlns:o="urn:schemas-microsoft-com:office:office" xmlns:oel="http://schemas.microsoft.com/office/2019/extlst" xmlns:r="http://schemas.openxmlformats.org/officeDocument/2006/relationships" xmlns:m="http://schemas.openxmlformats.org/officeDocument/2006/math" xmlns:v="urn:schemas-microsoft-com:vml" xmlns:wp14="http://schemas.microsoft.com/office/word/2010/wordprocessingDrawing" xmlns:wp="http://schemas.openxmlformats.org/drawingml/2006/wordprocessingDrawing" xmlns:w10="urn:schemas-microsoft-com:office:word" xmlns:w="http://schemas.openxmlformats.org/wordprocessingml/2006/main" xmlns:w14="http://schemas.microsoft.com/office/word/2010/wordml" xmlns:w15="http://schemas.microsoft.com/office/word/2012/wordml" xmlns:w16cex="http://schemas.microsoft.com/office/word/2018/wordml/cex" xmlns:w16cid="http://schemas.microsoft.com/office/word/2016/wordml/cid" xmlns:w16="http://schemas.microsoft.com/office/word/2018/wordml" xmlns:w16du="http://schemas.microsoft.com/office/word/2023/wordml/word16du" xmlns:w16sdtdh="http://schemas.microsoft.com/office/word/2020/wordml/sdtdatahash" xmlns:w16sdtfl="http://schemas.microsoft.com/office/word/2024/wordml/sdtformatlock" xmlns:w16se="http://schemas.microsoft.com/office/word/2015/wordml/symex" xmlns:wpg="http://schemas.microsoft.com/office/word/2010/wordprocessingGroup" xmlns:wpi="http://schemas.microsoft.com/office/word/2010/wordprocessingInk" xmlns:wne="http://schemas.microsoft.com/office/word/2006/wordml" xmlns:wps="http://schemas.microsoft.com/office/word/2010/wordprocessingShape" mc:Ignorable="w14 w15 w16se w16cid w16 w16cex w16sdtdh w16sdtfl w16du wp14">
   <w:footnote w:type="separator" w:id="-1">
     <w:p>
       <w:pPr>
@@ -1610,7 +1661,7 @@
 </file>
 
 <file path=word/header1.xml><?xml version="1.0" encoding="utf-8"?>
-<w:hdr xmlns:wpc="http://schemas.microsoft.com/office/word/2010/wordprocessingCanvas" xmlns:cx="http://schemas.microsoft.com/office/drawing/2014/chartex" xmlns:mc="http://schemas.openxmlformats.org/markup-compatibility/2006" xmlns:o="urn:schemas-microsoft-com:office:office" xmlns:r="http://schemas.openxmlformats.org/officeDocument/2006/relationships" xmlns:m="http://schemas.openxmlformats.org/officeDocument/2006/math" xmlns:v="urn:schemas-microsoft-com:vml" xmlns:wp14="http://schemas.microsoft.com/office/word/2010/wordprocessingDrawing" xmlns:wp="http://schemas.openxmlformats.org/drawingml/2006/wordprocessingDrawing" xmlns:w10="urn:schemas-microsoft-com:office:word" xmlns:w="http://schemas.openxmlformats.org/wordprocessingml/2006/main" xmlns:w14="http://schemas.microsoft.com/office/word/2010/wordml" xmlns:w15="http://schemas.microsoft.com/office/word/2012/wordml" xmlns:w16se="http://schemas.microsoft.com/office/word/2015/wordml/symex" xmlns:wpg="http://schemas.microsoft.com/office/word/2010/wordprocessingGroup" xmlns:wpi="http://schemas.microsoft.com/office/word/2010/wordprocessingInk" xmlns:wne="http://schemas.microsoft.com/office/word/2006/wordml" xmlns:wps="http://schemas.microsoft.com/office/word/2010/wordprocessingShape" mc:Ignorable="w14 w15 w16se wp14">
+<w:hdr xmlns:wpc="http://schemas.microsoft.com/office/word/2010/wordprocessingCanvas" xmlns:cx="http://schemas.microsoft.com/office/drawing/2014/chartex" xmlns:cx1="http://schemas.microsoft.com/office/drawing/2015/9/8/chartex" xmlns:cx2="http://schemas.microsoft.com/office/drawing/2015/10/21/chartex" xmlns:cx3="http://schemas.microsoft.com/office/drawing/2016/5/9/chartex" xmlns:cx4="http://schemas.microsoft.com/office/drawing/2016/5/10/chartex" xmlns:cx5="http://schemas.microsoft.com/office/drawing/2016/5/11/chartex" xmlns:cx6="http://schemas.microsoft.com/office/drawing/2016/5/12/chartex" xmlns:cx7="http://schemas.microsoft.com/office/drawing/2016/5/13/chartex" xmlns:cx8="http://schemas.microsoft.com/office/drawing/2016/5/14/chartex" xmlns:mc="http://schemas.openxmlformats.org/markup-compatibility/2006" xmlns:aink="http://schemas.microsoft.com/office/drawing/2016/ink" xmlns:am3d="http://schemas.microsoft.com/office/drawing/2017/model3d" xmlns:o="urn:schemas-microsoft-com:office:office" xmlns:oel="http://schemas.microsoft.com/office/2019/extlst" xmlns:r="http://schemas.openxmlformats.org/officeDocument/2006/relationships" xmlns:m="http://schemas.openxmlformats.org/officeDocument/2006/math" xmlns:v="urn:schemas-microsoft-com:vml" xmlns:wp14="http://schemas.microsoft.com/office/word/2010/wordprocessingDrawing" xmlns:wp="http://schemas.openxmlformats.org/drawingml/2006/wordprocessingDrawing" xmlns:w10="urn:schemas-microsoft-com:office:word" xmlns:w="http://schemas.openxmlformats.org/wordprocessingml/2006/main" xmlns:w14="http://schemas.microsoft.com/office/word/2010/wordml" xmlns:w15="http://schemas.microsoft.com/office/word/2012/wordml" xmlns:w16cex="http://schemas.microsoft.com/office/word/2018/wordml/cex" xmlns:w16cid="http://schemas.microsoft.com/office/word/2016/wordml/cid" xmlns:w16="http://schemas.microsoft.com/office/word/2018/wordml" xmlns:w16du="http://schemas.microsoft.com/office/word/2023/wordml/word16du" xmlns:w16sdtdh="http://schemas.microsoft.com/office/word/2020/wordml/sdtdatahash" xmlns:w16sdtfl="http://schemas.microsoft.com/office/word/2024/wordml/sdtformatlock" xmlns:w16se="http://schemas.microsoft.com/office/word/2015/wordml/symex" xmlns:wpg="http://schemas.microsoft.com/office/word/2010/wordprocessingGroup" xmlns:wpi="http://schemas.microsoft.com/office/word/2010/wordprocessingInk" xmlns:wne="http://schemas.microsoft.com/office/word/2006/wordml" xmlns:wps="http://schemas.microsoft.com/office/word/2010/wordprocessingShape" mc:Ignorable="w14 w15 w16se w16cid w16 w16cex w16sdtdh w16sdtfl w16du wp14">
   <w:tbl>
     <w:tblPr>
       <w:tblStyle w:val="Tablaconcuadrcula"/>
@@ -1790,7 +1841,7 @@
 </file>
 
 <file path=word/header2.xml><?xml version="1.0" encoding="utf-8"?>
-<w:hdr xmlns:wpc="http://schemas.microsoft.com/office/word/2010/wordprocessingCanvas" xmlns:cx="http://schemas.microsoft.com/office/drawing/2014/chartex" xmlns:mc="http://schemas.openxmlformats.org/markup-compatibility/2006" xmlns:o="urn:schemas-microsoft-com:office:office" xmlns:r="http://schemas.openxmlformats.org/officeDocument/2006/relationships" xmlns:m="http://schemas.openxmlformats.org/officeDocument/2006/math" xmlns:v="urn:schemas-microsoft-com:vml" xmlns:wp14="http://schemas.microsoft.com/office/word/2010/wordprocessingDrawing" xmlns:wp="http://schemas.openxmlformats.org/drawingml/2006/wordprocessingDrawing" xmlns:w10="urn:schemas-microsoft-com:office:word" xmlns:w="http://schemas.openxmlformats.org/wordprocessingml/2006/main" xmlns:w14="http://schemas.microsoft.com/office/word/2010/wordml" xmlns:w15="http://schemas.microsoft.com/office/word/2012/wordml" xmlns:w16se="http://schemas.microsoft.com/office/word/2015/wordml/symex" xmlns:wpg="http://schemas.microsoft.com/office/word/2010/wordprocessingGroup" xmlns:wpi="http://schemas.microsoft.com/office/word/2010/wordprocessingInk" xmlns:wne="http://schemas.microsoft.com/office/word/2006/wordml" xmlns:wps="http://schemas.microsoft.com/office/word/2010/wordprocessingShape" mc:Ignorable="w14 w15 w16se wp14">
+<w:hdr xmlns:wpc="http://schemas.microsoft.com/office/word/2010/wordprocessingCanvas" xmlns:cx="http://schemas.microsoft.com/office/drawing/2014/chartex" xmlns:cx1="http://schemas.microsoft.com/office/drawing/2015/9/8/chartex" xmlns:cx2="http://schemas.microsoft.com/office/drawing/2015/10/21/chartex" xmlns:cx3="http://schemas.microsoft.com/office/drawing/2016/5/9/chartex" xmlns:cx4="http://schemas.microsoft.com/office/drawing/2016/5/10/chartex" xmlns:cx5="http://schemas.microsoft.com/office/drawing/2016/5/11/chartex" xmlns:cx6="http://schemas.microsoft.com/office/drawing/2016/5/12/chartex" xmlns:cx7="http://schemas.microsoft.com/office/drawing/2016/5/13/chartex" xmlns:cx8="http://schemas.microsoft.com/office/drawing/2016/5/14/chartex" xmlns:mc="http://schemas.openxmlformats.org/markup-compatibility/2006" xmlns:aink="http://schemas.microsoft.com/office/drawing/2016/ink" xmlns:am3d="http://schemas.microsoft.com/office/drawing/2017/model3d" xmlns:o="urn:schemas-microsoft-com:office:office" xmlns:oel="http://schemas.microsoft.com/office/2019/extlst" xmlns:r="http://schemas.openxmlformats.org/officeDocument/2006/relationships" xmlns:m="http://schemas.openxmlformats.org/officeDocument/2006/math" xmlns:v="urn:schemas-microsoft-com:vml" xmlns:wp14="http://schemas.microsoft.com/office/word/2010/wordprocessingDrawing" xmlns:wp="http://schemas.openxmlformats.org/drawingml/2006/wordprocessingDrawing" xmlns:w10="urn:schemas-microsoft-com:office:word" xmlns:w="http://schemas.openxmlformats.org/wordprocessingml/2006/main" xmlns:w14="http://schemas.microsoft.com/office/word/2010/wordml" xmlns:w15="http://schemas.microsoft.com/office/word/2012/wordml" xmlns:w16cex="http://schemas.microsoft.com/office/word/2018/wordml/cex" xmlns:w16cid="http://schemas.microsoft.com/office/word/2016/wordml/cid" xmlns:w16="http://schemas.microsoft.com/office/word/2018/wordml" xmlns:w16du="http://schemas.microsoft.com/office/word/2023/wordml/word16du" xmlns:w16sdtdh="http://schemas.microsoft.com/office/word/2020/wordml/sdtdatahash" xmlns:w16sdtfl="http://schemas.microsoft.com/office/word/2024/wordml/sdtformatlock" xmlns:w16se="http://schemas.microsoft.com/office/word/2015/wordml/symex" xmlns:wpg="http://schemas.microsoft.com/office/word/2010/wordprocessingGroup" xmlns:wpi="http://schemas.microsoft.com/office/word/2010/wordprocessingInk" xmlns:wne="http://schemas.microsoft.com/office/word/2006/wordml" xmlns:wps="http://schemas.microsoft.com/office/word/2010/wordprocessingShape" mc:Ignorable="w14 w15 w16se w16cid w16 w16cex w16sdtdh w16sdtfl w16du wp14">
   <w:tbl>
     <w:tblPr>
       <w:tblStyle w:val="Tablaconcuadrcula"/>
@@ -2065,7 +2116,7 @@
 </file>
 
 <file path=word/numbering.xml><?xml version="1.0" encoding="utf-8"?>
-<w:numbering xmlns:wpc="http://schemas.microsoft.com/office/word/2010/wordprocessingCanvas" xmlns:cx="http://schemas.microsoft.com/office/drawing/2014/chartex" xmlns:mc="http://schemas.openxmlformats.org/markup-compatibility/2006" xmlns:o="urn:schemas-microsoft-com:office:office" xmlns:r="http://schemas.openxmlformats.org/officeDocument/2006/relationships" xmlns:m="http://schemas.openxmlformats.org/officeDocument/2006/math" xmlns:v="urn:schemas-microsoft-com:vml" xmlns:wp14="http://schemas.microsoft.com/office/word/2010/wordprocessingDrawing" xmlns:wp="http://schemas.openxmlformats.org/drawingml/2006/wordprocessingDrawing" xmlns:w10="urn:schemas-microsoft-com:office:word" xmlns:w="http://schemas.openxmlformats.org/wordprocessingml/2006/main" xmlns:w14="http://schemas.microsoft.com/office/word/2010/wordml" xmlns:w15="http://schemas.microsoft.com/office/word/2012/wordml" xmlns:w16se="http://schemas.microsoft.com/office/word/2015/wordml/symex" xmlns:wpg="http://schemas.microsoft.com/office/word/2010/wordprocessingGroup" xmlns:wpi="http://schemas.microsoft.com/office/word/2010/wordprocessingInk" xmlns:wne="http://schemas.microsoft.com/office/word/2006/wordml" xmlns:wps="http://schemas.microsoft.com/office/word/2010/wordprocessingShape" mc:Ignorable="w14 w15 w16se wp14">
+<w:numbering xmlns:wpc="http://schemas.microsoft.com/office/word/2010/wordprocessingCanvas" xmlns:cx="http://schemas.microsoft.com/office/drawing/2014/chartex" xmlns:cx1="http://schemas.microsoft.com/office/drawing/2015/9/8/chartex" xmlns:cx2="http://schemas.microsoft.com/office/drawing/2015/10/21/chartex" xmlns:cx3="http://schemas.microsoft.com/office/drawing/2016/5/9/chartex" xmlns:cx4="http://schemas.microsoft.com/office/drawing/2016/5/10/chartex" xmlns:cx5="http://schemas.microsoft.com/office/drawing/2016/5/11/chartex" xmlns:cx6="http://schemas.microsoft.com/office/drawing/2016/5/12/chartex" xmlns:cx7="http://schemas.microsoft.com/office/drawing/2016/5/13/chartex" xmlns:cx8="http://schemas.microsoft.com/office/drawing/2016/5/14/chartex" xmlns:mc="http://schemas.openxmlformats.org/markup-compatibility/2006" xmlns:aink="http://schemas.microsoft.com/office/drawing/2016/ink" xmlns:am3d="http://schemas.microsoft.com/office/drawing/2017/model3d" xmlns:o="urn:schemas-microsoft-com:office:office" xmlns:oel="http://schemas.microsoft.com/office/2019/extlst" xmlns:r="http://schemas.openxmlformats.org/officeDocument/2006/relationships" xmlns:m="http://schemas.openxmlformats.org/officeDocument/2006/math" xmlns:v="urn:schemas-microsoft-com:vml" xmlns:wp14="http://schemas.microsoft.com/office/word/2010/wordprocessingDrawing" xmlns:wp="http://schemas.openxmlformats.org/drawingml/2006/wordprocessingDrawing" xmlns:w10="urn:schemas-microsoft-com:office:word" xmlns:w="http://schemas.openxmlformats.org/wordprocessingml/2006/main" xmlns:w14="http://schemas.microsoft.com/office/word/2010/wordml" xmlns:w15="http://schemas.microsoft.com/office/word/2012/wordml" xmlns:w16cex="http://schemas.microsoft.com/office/word/2018/wordml/cex" xmlns:w16cid="http://schemas.microsoft.com/office/word/2016/wordml/cid" xmlns:w16="http://schemas.microsoft.com/office/word/2018/wordml" xmlns:w16du="http://schemas.microsoft.com/office/word/2023/wordml/word16du" xmlns:w16sdtdh="http://schemas.microsoft.com/office/word/2020/wordml/sdtdatahash" xmlns:w16sdtfl="http://schemas.microsoft.com/office/word/2024/wordml/sdtformatlock" xmlns:w16se="http://schemas.microsoft.com/office/word/2015/wordml/symex" xmlns:wpg="http://schemas.microsoft.com/office/word/2010/wordprocessingGroup" xmlns:wpi="http://schemas.microsoft.com/office/word/2010/wordprocessingInk" xmlns:wne="http://schemas.microsoft.com/office/word/2006/wordml" xmlns:wps="http://schemas.microsoft.com/office/word/2010/wordprocessingShape" mc:Ignorable="w14 w15 w16se w16cid w16 w16cex w16sdtdh w16sdtfl w16du wp14">
   <w:abstractNum w:abstractNumId="0" w15:restartNumberingAfterBreak="0">
     <w:nsid w:val="049156A1"/>
     <w:multiLevelType w:val="hybridMultilevel"/>
@@ -6639,124 +6690,124 @@
       </w:rPr>
     </w:lvl>
   </w:abstractNum>
-  <w:num w:numId="1">
+  <w:num w:numId="1" w16cid:durableId="1334839204">
     <w:abstractNumId w:val="3"/>
   </w:num>
-  <w:num w:numId="2">
+  <w:num w:numId="2" w16cid:durableId="1105420448">
     <w:abstractNumId w:val="8"/>
   </w:num>
-  <w:num w:numId="3">
+  <w:num w:numId="3" w16cid:durableId="1505248197">
     <w:abstractNumId w:val="12"/>
   </w:num>
-  <w:num w:numId="4">
+  <w:num w:numId="4" w16cid:durableId="1727030106">
     <w:abstractNumId w:val="28"/>
   </w:num>
-  <w:num w:numId="5">
+  <w:num w:numId="5" w16cid:durableId="1371153518">
     <w:abstractNumId w:val="30"/>
   </w:num>
-  <w:num w:numId="6">
+  <w:num w:numId="6" w16cid:durableId="1767460740">
     <w:abstractNumId w:val="4"/>
   </w:num>
-  <w:num w:numId="7">
+  <w:num w:numId="7" w16cid:durableId="1107194342">
     <w:abstractNumId w:val="11"/>
   </w:num>
-  <w:num w:numId="8">
+  <w:num w:numId="8" w16cid:durableId="380515339">
     <w:abstractNumId w:val="19"/>
   </w:num>
-  <w:num w:numId="9">
+  <w:num w:numId="9" w16cid:durableId="392892254">
     <w:abstractNumId w:val="15"/>
   </w:num>
-  <w:num w:numId="10">
+  <w:num w:numId="10" w16cid:durableId="956982714">
     <w:abstractNumId w:val="9"/>
   </w:num>
-  <w:num w:numId="11">
+  <w:num w:numId="11" w16cid:durableId="457996157">
     <w:abstractNumId w:val="24"/>
   </w:num>
-  <w:num w:numId="12">
+  <w:num w:numId="12" w16cid:durableId="26297910">
     <w:abstractNumId w:val="35"/>
   </w:num>
-  <w:num w:numId="13">
+  <w:num w:numId="13" w16cid:durableId="809788320">
     <w:abstractNumId w:val="29"/>
   </w:num>
-  <w:num w:numId="14">
+  <w:num w:numId="14" w16cid:durableId="1085153068">
     <w:abstractNumId w:val="1"/>
   </w:num>
-  <w:num w:numId="15">
+  <w:num w:numId="15" w16cid:durableId="247152322">
     <w:abstractNumId w:val="36"/>
   </w:num>
-  <w:num w:numId="16">
+  <w:num w:numId="16" w16cid:durableId="1998997485">
     <w:abstractNumId w:val="21"/>
   </w:num>
-  <w:num w:numId="17">
+  <w:num w:numId="17" w16cid:durableId="1420785474">
     <w:abstractNumId w:val="17"/>
   </w:num>
-  <w:num w:numId="18">
+  <w:num w:numId="18" w16cid:durableId="471874558">
     <w:abstractNumId w:val="31"/>
   </w:num>
-  <w:num w:numId="19">
+  <w:num w:numId="19" w16cid:durableId="803036451">
     <w:abstractNumId w:val="10"/>
   </w:num>
-  <w:num w:numId="20">
+  <w:num w:numId="20" w16cid:durableId="600532869">
     <w:abstractNumId w:val="39"/>
   </w:num>
-  <w:num w:numId="21">
+  <w:num w:numId="21" w16cid:durableId="891039948">
     <w:abstractNumId w:val="34"/>
   </w:num>
-  <w:num w:numId="22">
+  <w:num w:numId="22" w16cid:durableId="154884139">
     <w:abstractNumId w:val="13"/>
   </w:num>
-  <w:num w:numId="23">
+  <w:num w:numId="23" w16cid:durableId="419179739">
     <w:abstractNumId w:val="14"/>
   </w:num>
-  <w:num w:numId="24">
+  <w:num w:numId="24" w16cid:durableId="398986940">
     <w:abstractNumId w:val="5"/>
   </w:num>
-  <w:num w:numId="25">
+  <w:num w:numId="25" w16cid:durableId="722560469">
     <w:abstractNumId w:val="16"/>
   </w:num>
-  <w:num w:numId="26">
+  <w:num w:numId="26" w16cid:durableId="327680095">
     <w:abstractNumId w:val="20"/>
   </w:num>
-  <w:num w:numId="27">
+  <w:num w:numId="27" w16cid:durableId="1549144732">
     <w:abstractNumId w:val="23"/>
   </w:num>
-  <w:num w:numId="28">
+  <w:num w:numId="28" w16cid:durableId="39061205">
     <w:abstractNumId w:val="0"/>
   </w:num>
-  <w:num w:numId="29">
+  <w:num w:numId="29" w16cid:durableId="712735399">
     <w:abstractNumId w:val="18"/>
   </w:num>
-  <w:num w:numId="30">
+  <w:num w:numId="30" w16cid:durableId="1541819601">
     <w:abstractNumId w:val="22"/>
   </w:num>
-  <w:num w:numId="31">
+  <w:num w:numId="31" w16cid:durableId="1089616104">
     <w:abstractNumId w:val="2"/>
   </w:num>
-  <w:num w:numId="32">
+  <w:num w:numId="32" w16cid:durableId="460539991">
     <w:abstractNumId w:val="7"/>
   </w:num>
-  <w:num w:numId="33">
+  <w:num w:numId="33" w16cid:durableId="2829271">
     <w:abstractNumId w:val="32"/>
   </w:num>
-  <w:num w:numId="34">
+  <w:num w:numId="34" w16cid:durableId="1186554914">
     <w:abstractNumId w:val="38"/>
   </w:num>
-  <w:num w:numId="35">
+  <w:num w:numId="35" w16cid:durableId="913054538">
     <w:abstractNumId w:val="6"/>
   </w:num>
-  <w:num w:numId="36">
+  <w:num w:numId="36" w16cid:durableId="1386872832">
     <w:abstractNumId w:val="25"/>
   </w:num>
-  <w:num w:numId="37">
+  <w:num w:numId="37" w16cid:durableId="1754886549">
     <w:abstractNumId w:val="37"/>
   </w:num>
-  <w:num w:numId="38">
+  <w:num w:numId="38" w16cid:durableId="473648074">
     <w:abstractNumId w:val="27"/>
   </w:num>
-  <w:num w:numId="39">
+  <w:num w:numId="39" w16cid:durableId="1423188748">
     <w:abstractNumId w:val="26"/>
   </w:num>
-  <w:num w:numId="40">
+  <w:num w:numId="40" w16cid:durableId="1586647442">
     <w:abstractNumId w:val="33"/>
   </w:num>
   <w:numIdMacAtCleanup w:val="18"/>
@@ -6764,7 +6815,7 @@
 </file>
 
 <file path=word/styles.xml><?xml version="1.0" encoding="utf-8"?>
-<w:styles xmlns:mc="http://schemas.openxmlformats.org/markup-compatibility/2006" xmlns:r="http://schemas.openxmlformats.org/officeDocument/2006/relationships" xmlns:w="http://schemas.openxmlformats.org/wordprocessingml/2006/main" xmlns:w14="http://schemas.microsoft.com/office/word/2010/wordml" xmlns:w15="http://schemas.microsoft.com/office/word/2012/wordml" xmlns:w16se="http://schemas.microsoft.com/office/word/2015/wordml/symex" mc:Ignorable="w14 w15 w16se">
+<w:styles xmlns:mc="http://schemas.openxmlformats.org/markup-compatibility/2006" xmlns:r="http://schemas.openxmlformats.org/officeDocument/2006/relationships" xmlns:w="http://schemas.openxmlformats.org/wordprocessingml/2006/main" xmlns:w14="http://schemas.microsoft.com/office/word/2010/wordml" xmlns:w15="http://schemas.microsoft.com/office/word/2012/wordml" xmlns:w16cex="http://schemas.microsoft.com/office/word/2018/wordml/cex" xmlns:w16cid="http://schemas.microsoft.com/office/word/2016/wordml/cid" xmlns:w16="http://schemas.microsoft.com/office/word/2018/wordml" xmlns:w16du="http://schemas.microsoft.com/office/word/2023/wordml/word16du" xmlns:w16sdtdh="http://schemas.microsoft.com/office/word/2020/wordml/sdtdatahash" xmlns:w16sdtfl="http://schemas.microsoft.com/office/word/2024/wordml/sdtformatlock" xmlns:w16se="http://schemas.microsoft.com/office/word/2015/wordml/symex" mc:Ignorable="w14 w15 w16se w16cid w16 w16cex w16sdtdh w16sdtfl w16du">
   <w:docDefaults>
     <w:rPrDefault>
       <w:rPr>
@@ -6780,7 +6831,7 @@
       </w:pPr>
     </w:pPrDefault>
   </w:docDefaults>
-  <w:latentStyles w:defLockedState="0" w:defUIPriority="99" w:defSemiHidden="0" w:defUnhideWhenUsed="0" w:defQFormat="0" w:count="371">
+  <w:latentStyles w:defLockedState="0" w:defUIPriority="99" w:defSemiHidden="0" w:defUnhideWhenUsed="0" w:defQFormat="0" w:count="376">
     <w:lsdException w:name="Normal" w:uiPriority="0" w:qFormat="1"/>
     <w:lsdException w:name="heading 1" w:uiPriority="9" w:qFormat="1"/>
     <w:lsdException w:name="heading 2" w:semiHidden="1" w:uiPriority="9" w:unhideWhenUsed="1" w:qFormat="1"/>
@@ -7152,6 +7203,11 @@
     <w:lsdException w:name="List Table 5 Dark Accent 6" w:uiPriority="50"/>
     <w:lsdException w:name="List Table 6 Colorful Accent 6" w:uiPriority="51"/>
     <w:lsdException w:name="List Table 7 Colorful Accent 6" w:uiPriority="52"/>
+    <w:lsdException w:name="Mention" w:semiHidden="1" w:unhideWhenUsed="1"/>
+    <w:lsdException w:name="Smart Hyperlink" w:semiHidden="1" w:unhideWhenUsed="1"/>
+    <w:lsdException w:name="Hashtag" w:semiHidden="1" w:unhideWhenUsed="1"/>
+    <w:lsdException w:name="Unresolved Mention" w:semiHidden="1" w:unhideWhenUsed="1"/>
+    <w:lsdException w:name="Smart Link" w:semiHidden="1" w:unhideWhenUsed="1"/>
   </w:latentStyles>
   <w:style w:type="paragraph" w:default="1" w:styleId="Normal">
     <w:name w:val="Normal"/>
@@ -8135,7 +8191,7 @@
       <w:szCs w:val="24"/>
     </w:rPr>
   </w:style>
-  <w:style w:type="table" w:styleId="Cuadrculadetablaclara">
+  <w:style w:type="table" w:styleId="Tablaconcuadrculaclara">
     <w:name w:val="Grid Table Light"/>
     <w:basedOn w:val="Tablanormal"/>
     <w:uiPriority w:val="40"/>
@@ -8157,7 +8213,7 @@
   <w:style w:type="table" w:customStyle="1" w:styleId="Cuadrculadetablaclara1">
     <w:name w:val="Cuadrícula de tabla clara1"/>
     <w:basedOn w:val="Tablanormal"/>
-    <w:next w:val="Cuadrculadetablaclara"/>
+    <w:next w:val="Tablaconcuadrculaclara"/>
     <w:uiPriority w:val="40"/>
     <w:rsid w:val="00943DF1"/>
     <w:pPr>
@@ -8198,7 +8254,7 @@
       <w:spacing w:after="0" w:line="240" w:lineRule="auto"/>
     </w:pPr>
   </w:style>
-  <w:style w:type="character" w:styleId="Textoennegrita">
+  <w:style w:type="character" w:styleId="Fuerte">
     <w:name w:val="Strong"/>
     <w:basedOn w:val="Fuentedeprrafopredeter"/>
     <w:uiPriority w:val="22"/>
@@ -8210,532 +8266,6 @@
     </w:rPr>
   </w:style>
 </w:styles>
-</file>
-
-<file path=word/glossary/document.xml><?xml version="1.0" encoding="utf-8"?>
-<w:glossaryDocument xmlns:wpc="http://schemas.microsoft.com/office/word/2010/wordprocessingCanvas" xmlns:cx="http://schemas.microsoft.com/office/drawing/2014/chartex" xmlns:mc="http://schemas.openxmlformats.org/markup-compatibility/2006" xmlns:o="urn:schemas-microsoft-com:office:office" xmlns:r="http://schemas.openxmlformats.org/officeDocument/2006/relationships" xmlns:m="http://schemas.openxmlformats.org/officeDocument/2006/math" xmlns:v="urn:schemas-microsoft-com:vml" xmlns:wp14="http://schemas.microsoft.com/office/word/2010/wordprocessingDrawing" xmlns:wp="http://schemas.openxmlformats.org/drawingml/2006/wordprocessingDrawing" xmlns:w10="urn:schemas-microsoft-com:office:word" xmlns:w="http://schemas.openxmlformats.org/wordprocessingml/2006/main" xmlns:w14="http://schemas.microsoft.com/office/word/2010/wordml" xmlns:w15="http://schemas.microsoft.com/office/word/2012/wordml" xmlns:w16se="http://schemas.microsoft.com/office/word/2015/wordml/symex" xmlns:wpg="http://schemas.microsoft.com/office/word/2010/wordprocessingGroup" xmlns:wpi="http://schemas.microsoft.com/office/word/2010/wordprocessingInk" xmlns:wne="http://schemas.microsoft.com/office/word/2006/wordml" xmlns:wps="http://schemas.microsoft.com/office/word/2010/wordprocessingShape" mc:Ignorable="w14 w15 w16se wp14"/>
-</file>
-
-<file path=word/glossary/fontTable.xml><?xml version="1.0" encoding="utf-8"?>
-<w:fonts xmlns:mc="http://schemas.openxmlformats.org/markup-compatibility/2006" xmlns:r="http://schemas.openxmlformats.org/officeDocument/2006/relationships" xmlns:w="http://schemas.openxmlformats.org/wordprocessingml/2006/main" xmlns:w14="http://schemas.microsoft.com/office/word/2010/wordml" xmlns:w15="http://schemas.microsoft.com/office/word/2012/wordml" xmlns:w16se="http://schemas.microsoft.com/office/word/2015/wordml/symex" mc:Ignorable="w14 w15 w16se">
-  <w:font w:name="Calibri">
-    <w:panose1 w:val="020F0502020204030204"/>
-    <w:charset w:val="00"/>
-    <w:family w:val="swiss"/>
-    <w:pitch w:val="variable"/>
-    <w:sig w:usb0="E4002EFF" w:usb1="C000247B" w:usb2="00000009" w:usb3="00000000" w:csb0="000001FF" w:csb1="00000000"/>
-  </w:font>
-  <w:font w:name="Times New Roman">
-    <w:panose1 w:val="02020603050405020304"/>
-    <w:charset w:val="00"/>
-    <w:family w:val="roman"/>
-    <w:pitch w:val="variable"/>
-    <w:sig w:usb0="E0002EFF" w:usb1="C000785B" w:usb2="00000009" w:usb3="00000000" w:csb0="000001FF" w:csb1="00000000"/>
-  </w:font>
-  <w:font w:name="Courier New">
-    <w:panose1 w:val="02070309020205020404"/>
-    <w:charset w:val="00"/>
-    <w:family w:val="modern"/>
-    <w:pitch w:val="fixed"/>
-    <w:sig w:usb0="E0002EFF" w:usb1="C0007843" w:usb2="00000009" w:usb3="00000000" w:csb0="000001FF" w:csb1="00000000"/>
-  </w:font>
-  <w:font w:name="Wingdings">
-    <w:panose1 w:val="05000000000000000000"/>
-    <w:charset w:val="02"/>
-    <w:family w:val="auto"/>
-    <w:pitch w:val="variable"/>
-    <w:sig w:usb0="00000000" w:usb1="10000000" w:usb2="00000000" w:usb3="00000000" w:csb0="80000000" w:csb1="00000000"/>
-  </w:font>
-  <w:font w:name="Symbol">
-    <w:panose1 w:val="05050102010706020507"/>
-    <w:charset w:val="02"/>
-    <w:family w:val="roman"/>
-    <w:pitch w:val="variable"/>
-    <w:sig w:usb0="00000000" w:usb1="10000000" w:usb2="00000000" w:usb3="00000000" w:csb0="80000000" w:csb1="00000000"/>
-  </w:font>
-  <w:font w:name="Calibri Light">
-    <w:panose1 w:val="020F0302020204030204"/>
-    <w:charset w:val="00"/>
-    <w:family w:val="swiss"/>
-    <w:pitch w:val="variable"/>
-    <w:sig w:usb0="E4002EFF" w:usb1="C000247B" w:usb2="00000009" w:usb3="00000000" w:csb0="000001FF" w:csb1="00000000"/>
-  </w:font>
-  <w:font w:name="Segoe UI">
-    <w:panose1 w:val="020B0502040204020203"/>
-    <w:charset w:val="00"/>
-    <w:family w:val="swiss"/>
-    <w:pitch w:val="variable"/>
-    <w:sig w:usb0="E4002EFF" w:usb1="C000E47F" w:usb2="00000009" w:usb3="00000000" w:csb0="000001FF" w:csb1="00000000"/>
-  </w:font>
-  <w:font w:name="Century Gothic">
-    <w:panose1 w:val="020B0502020202020204"/>
-    <w:charset w:val="00"/>
-    <w:family w:val="swiss"/>
-    <w:pitch w:val="variable"/>
-    <w:sig w:usb0="00000287" w:usb1="00000000" w:usb2="00000000" w:usb3="00000000" w:csb0="0000009F" w:csb1="00000000"/>
-  </w:font>
-</w:fonts>
-</file>
-
-<file path=word/glossary/settings.xml><?xml version="1.0" encoding="utf-8"?>
-<w:settings xmlns:mc="http://schemas.openxmlformats.org/markup-compatibility/2006" xmlns:o="urn:schemas-microsoft-com:office:office" xmlns:r="http://schemas.openxmlformats.org/officeDocument/2006/relationships" xmlns:m="http://schemas.openxmlformats.org/officeDocument/2006/math" xmlns:v="urn:schemas-microsoft-com:vml" xmlns:w10="urn:schemas-microsoft-com:office:word" xmlns:w="http://schemas.openxmlformats.org/wordprocessingml/2006/main" xmlns:w14="http://schemas.microsoft.com/office/word/2010/wordml" xmlns:w15="http://schemas.microsoft.com/office/word/2012/wordml" xmlns:w16se="http://schemas.microsoft.com/office/word/2015/wordml/symex" xmlns:sl="http://schemas.openxmlformats.org/schemaLibrary/2006/main" mc:Ignorable="w14 w15 w16se">
-  <w:defaultTabStop w:val="708"/>
-  <w:hyphenationZone w:val="425"/>
-  <w:characterSpacingControl w:val="doNotCompress"/>
-  <w:compat>
-    <w:useFELayout/>
-    <w:compatSetting w:name="compatibilityMode" w:uri="http://schemas.microsoft.com/office/word" w:val="12"/>
-  </w:compat>
-  <w:rsids>
-    <w:rsidRoot w:val="008F14D6"/>
-    <w:rsid w:val="008F14D6"/>
-  </w:rsids>
-  <m:mathPr>
-    <m:mathFont m:val="Cambria Math"/>
-    <m:brkBin m:val="before"/>
-    <m:brkBinSub m:val="--"/>
-    <m:smallFrac m:val="0"/>
-    <m:dispDef/>
-    <m:lMargin m:val="0"/>
-    <m:rMargin m:val="0"/>
-    <m:defJc m:val="centerGroup"/>
-    <m:wrapIndent m:val="1440"/>
-    <m:intLim m:val="subSup"/>
-    <m:naryLim m:val="undOvr"/>
-  </m:mathPr>
-  <w:themeFontLang w:val="es-CL"/>
-  <w:clrSchemeMapping w:bg1="light1" w:t1="dark1" w:bg2="light2" w:t2="dark2" w:accent1="accent1" w:accent2="accent2" w:accent3="accent3" w:accent4="accent4" w:accent5="accent5" w:accent6="accent6" w:hyperlink="hyperlink" w:followedHyperlink="followedHyperlink"/>
-  <w:decimalSymbol w:val=","/>
-  <w:listSeparator w:val=";"/>
-</w:settings>
-</file>
-
-<file path=word/glossary/styles.xml><?xml version="1.0" encoding="utf-8"?>
-<w:styles xmlns:mc="http://schemas.openxmlformats.org/markup-compatibility/2006" xmlns:r="http://schemas.openxmlformats.org/officeDocument/2006/relationships" xmlns:w="http://schemas.openxmlformats.org/wordprocessingml/2006/main" xmlns:w14="http://schemas.microsoft.com/office/word/2010/wordml" xmlns:w15="http://schemas.microsoft.com/office/word/2012/wordml" xmlns:w16se="http://schemas.microsoft.com/office/word/2015/wordml/symex" mc:Ignorable="w14 w15 w16se">
-  <w:docDefaults>
-    <w:rPrDefault>
-      <w:rPr>
-        <w:rFonts w:asciiTheme="minorHAnsi" w:eastAsiaTheme="minorEastAsia" w:hAnsiTheme="minorHAnsi" w:cstheme="minorBidi"/>
-        <w:sz w:val="22"/>
-        <w:szCs w:val="22"/>
-        <w:lang w:val="es-CL" w:eastAsia="es-CL" w:bidi="ar-SA"/>
-      </w:rPr>
-    </w:rPrDefault>
-    <w:pPrDefault>
-      <w:pPr>
-        <w:spacing w:after="160" w:line="259" w:lineRule="auto"/>
-      </w:pPr>
-    </w:pPrDefault>
-  </w:docDefaults>
-  <w:latentStyles w:defLockedState="0" w:defUIPriority="99" w:defSemiHidden="0" w:defUnhideWhenUsed="0" w:defQFormat="0" w:count="371">
-    <w:lsdException w:name="Normal" w:uiPriority="0" w:qFormat="1"/>
-    <w:lsdException w:name="heading 1" w:uiPriority="9" w:qFormat="1"/>
-    <w:lsdException w:name="heading 2" w:semiHidden="1" w:uiPriority="9" w:unhideWhenUsed="1" w:qFormat="1"/>
-    <w:lsdException w:name="heading 3" w:semiHidden="1" w:uiPriority="9" w:unhideWhenUsed="1" w:qFormat="1"/>
-    <w:lsdException w:name="heading 4" w:semiHidden="1" w:uiPriority="9" w:unhideWhenUsed="1" w:qFormat="1"/>
-    <w:lsdException w:name="heading 5" w:semiHidden="1" w:uiPriority="9" w:unhideWhenUsed="1" w:qFormat="1"/>
-    <w:lsdException w:name="heading 6" w:semiHidden="1" w:uiPriority="9" w:unhideWhenUsed="1" w:qFormat="1"/>
-    <w:lsdException w:name="heading 7" w:semiHidden="1" w:uiPriority="9" w:unhideWhenUsed="1" w:qFormat="1"/>
-    <w:lsdException w:name="heading 8" w:semiHidden="1" w:uiPriority="9" w:unhideWhenUsed="1" w:qFormat="1"/>
-    <w:lsdException w:name="heading 9" w:semiHidden="1" w:uiPriority="9" w:unhideWhenUsed="1" w:qFormat="1"/>
-    <w:lsdException w:name="index 1" w:semiHidden="1" w:unhideWhenUsed="1"/>
-    <w:lsdException w:name="index 2" w:semiHidden="1" w:unhideWhenUsed="1"/>
-    <w:lsdException w:name="index 3" w:semiHidden="1" w:unhideWhenUsed="1"/>
-    <w:lsdException w:name="index 4" w:semiHidden="1" w:unhideWhenUsed="1"/>
-    <w:lsdException w:name="index 5" w:semiHidden="1" w:unhideWhenUsed="1"/>
-    <w:lsdException w:name="index 6" w:semiHidden="1" w:unhideWhenUsed="1"/>
-    <w:lsdException w:name="index 7" w:semiHidden="1" w:unhideWhenUsed="1"/>
-    <w:lsdException w:name="index 8" w:semiHidden="1" w:unhideWhenUsed="1"/>
-    <w:lsdException w:name="index 9" w:semiHidden="1" w:unhideWhenUsed="1"/>
-    <w:lsdException w:name="toc 1" w:semiHidden="1" w:uiPriority="39" w:unhideWhenUsed="1"/>
-    <w:lsdException w:name="toc 2" w:semiHidden="1" w:uiPriority="39" w:unhideWhenUsed="1"/>
-    <w:lsdException w:name="toc 3" w:semiHidden="1" w:uiPriority="39" w:unhideWhenUsed="1"/>
-    <w:lsdException w:name="toc 4" w:semiHidden="1" w:uiPriority="39" w:unhideWhenUsed="1"/>
-    <w:lsdException w:name="toc 5" w:semiHidden="1" w:uiPriority="39" w:unhideWhenUsed="1"/>
-    <w:lsdException w:name="toc 6" w:semiHidden="1" w:uiPriority="39" w:unhideWhenUsed="1"/>
-    <w:lsdException w:name="toc 7" w:semiHidden="1" w:uiPriority="39" w:unhideWhenUsed="1"/>
-    <w:lsdException w:name="toc 8" w:semiHidden="1" w:uiPriority="39" w:unhideWhenUsed="1"/>
-    <w:lsdException w:name="toc 9" w:semiHidden="1" w:uiPriority="39" w:unhideWhenUsed="1"/>
-    <w:lsdException w:name="Normal Indent" w:semiHidden="1" w:unhideWhenUsed="1"/>
-    <w:lsdException w:name="footnote text" w:semiHidden="1" w:unhideWhenUsed="1"/>
-    <w:lsdException w:name="annotation text" w:semiHidden="1" w:unhideWhenUsed="1"/>
-    <w:lsdException w:name="header" w:semiHidden="1" w:unhideWhenUsed="1"/>
-    <w:lsdException w:name="footer" w:semiHidden="1" w:unhideWhenUsed="1"/>
-    <w:lsdException w:name="index heading" w:semiHidden="1" w:unhideWhenUsed="1"/>
-    <w:lsdException w:name="caption" w:semiHidden="1" w:uiPriority="35" w:unhideWhenUsed="1" w:qFormat="1"/>
-    <w:lsdException w:name="table of figures" w:semiHidden="1" w:unhideWhenUsed="1"/>
-    <w:lsdException w:name="envelope address" w:semiHidden="1" w:unhideWhenUsed="1"/>
-    <w:lsdException w:name="envelope return" w:semiHidden="1" w:unhideWhenUsed="1"/>
-    <w:lsdException w:name="footnote reference" w:semiHidden="1" w:unhideWhenUsed="1"/>
-    <w:lsdException w:name="annotation reference" w:semiHidden="1" w:unhideWhenUsed="1"/>
-    <w:lsdException w:name="line number" w:semiHidden="1" w:unhideWhenUsed="1"/>
-    <w:lsdException w:name="page number" w:semiHidden="1" w:unhideWhenUsed="1"/>
-    <w:lsdException w:name="endnote reference" w:semiHidden="1" w:unhideWhenUsed="1"/>
-    <w:lsdException w:name="endnote text" w:semiHidden="1" w:unhideWhenUsed="1"/>
-    <w:lsdException w:name="table of authorities" w:semiHidden="1" w:unhideWhenUsed="1"/>
-    <w:lsdException w:name="macro" w:semiHidden="1" w:unhideWhenUsed="1"/>
-    <w:lsdException w:name="toa heading" w:semiHidden="1" w:unhideWhenUsed="1"/>
-    <w:lsdException w:name="List" w:semiHidden="1" w:unhideWhenUsed="1"/>
-    <w:lsdException w:name="List Bullet" w:semiHidden="1" w:unhideWhenUsed="1"/>
-    <w:lsdException w:name="List Number" w:semiHidden="1" w:unhideWhenUsed="1"/>
-    <w:lsdException w:name="List 2" w:semiHidden="1" w:unhideWhenUsed="1"/>
-    <w:lsdException w:name="List 3" w:semiHidden="1" w:unhideWhenUsed="1"/>
-    <w:lsdException w:name="List 4" w:semiHidden="1" w:unhideWhenUsed="1"/>
-    <w:lsdException w:name="List 5" w:semiHidden="1" w:unhideWhenUsed="1"/>
-    <w:lsdException w:name="List Bullet 2" w:semiHidden="1" w:unhideWhenUsed="1"/>
-    <w:lsdException w:name="List Bullet 3" w:semiHidden="1" w:unhideWhenUsed="1"/>
-    <w:lsdException w:name="List Bullet 4" w:semiHidden="1" w:unhideWhenUsed="1"/>
-    <w:lsdException w:name="List Bullet 5" w:semiHidden="1" w:unhideWhenUsed="1"/>
-    <w:lsdException w:name="List Number 2" w:semiHidden="1" w:unhideWhenUsed="1"/>
-    <w:lsdException w:name="List Number 3" w:semiHidden="1" w:unhideWhenUsed="1"/>
-    <w:lsdException w:name="List Number 4" w:semiHidden="1" w:unhideWhenUsed="1"/>
-    <w:lsdException w:name="List Number 5" w:semiHidden="1" w:unhideWhenUsed="1"/>
-    <w:lsdException w:name="Title" w:uiPriority="10" w:qFormat="1"/>
-    <w:lsdException w:name="Closing" w:semiHidden="1" w:unhideWhenUsed="1"/>
-    <w:lsdException w:name="Signature" w:semiHidden="1" w:unhideWhenUsed="1"/>
-    <w:lsdException w:name="Default Paragraph Font" w:semiHidden="1" w:uiPriority="1" w:unhideWhenUsed="1"/>
-    <w:lsdException w:name="Body Text" w:semiHidden="1" w:unhideWhenUsed="1"/>
-    <w:lsdException w:name="Body Text Indent" w:semiHidden="1" w:unhideWhenUsed="1"/>
-    <w:lsdException w:name="List Continue" w:semiHidden="1" w:unhideWhenUsed="1"/>
-    <w:lsdException w:name="List Continue 2" w:semiHidden="1" w:unhideWhenUsed="1"/>
-    <w:lsdException w:name="List Continue 3" w:semiHidden="1" w:unhideWhenUsed="1"/>
-    <w:lsdException w:name="List Continue 4" w:semiHidden="1" w:unhideWhenUsed="1"/>
-    <w:lsdException w:name="List Continue 5" w:semiHidden="1" w:unhideWhenUsed="1"/>
-    <w:lsdException w:name="Message Header" w:semiHidden="1" w:unhideWhenUsed="1"/>
-    <w:lsdException w:name="Subtitle" w:uiPriority="11" w:qFormat="1"/>
-    <w:lsdException w:name="Salutation" w:semiHidden="1" w:unhideWhenUsed="1"/>
-    <w:lsdException w:name="Date" w:semiHidden="1" w:unhideWhenUsed="1"/>
-    <w:lsdException w:name="Body Text First Indent" w:semiHidden="1" w:unhideWhenUsed="1"/>
-    <w:lsdException w:name="Body Text First Indent 2" w:semiHidden="1" w:unhideWhenUsed="1"/>
-    <w:lsdException w:name="Note Heading" w:semiHidden="1" w:unhideWhenUsed="1"/>
-    <w:lsdException w:name="Body Text 2" w:semiHidden="1" w:unhideWhenUsed="1"/>
-    <w:lsdException w:name="Body Text 3" w:semiHidden="1" w:unhideWhenUsed="1"/>
-    <w:lsdException w:name="Body Text Indent 2" w:semiHidden="1" w:unhideWhenUsed="1"/>
-    <w:lsdException w:name="Body Text Indent 3" w:semiHidden="1" w:unhideWhenUsed="1"/>
-    <w:lsdException w:name="Block Text" w:semiHidden="1" w:unhideWhenUsed="1"/>
-    <w:lsdException w:name="Hyperlink" w:semiHidden="1" w:unhideWhenUsed="1"/>
-    <w:lsdException w:name="FollowedHyperlink" w:semiHidden="1" w:unhideWhenUsed="1"/>
-    <w:lsdException w:name="Strong" w:uiPriority="22" w:qFormat="1"/>
-    <w:lsdException w:name="Emphasis" w:uiPriority="20" w:qFormat="1"/>
-    <w:lsdException w:name="Document Map" w:semiHidden="1" w:unhideWhenUsed="1"/>
-    <w:lsdException w:name="Plain Text" w:semiHidden="1" w:unhideWhenUsed="1"/>
-    <w:lsdException w:name="E-mail Signature" w:semiHidden="1" w:unhideWhenUsed="1"/>
-    <w:lsdException w:name="HTML Top of Form" w:semiHidden="1" w:unhideWhenUsed="1"/>
-    <w:lsdException w:name="HTML Bottom of Form" w:semiHidden="1" w:unhideWhenUsed="1"/>
-    <w:lsdException w:name="Normal (Web)" w:semiHidden="1" w:unhideWhenUsed="1"/>
-    <w:lsdException w:name="HTML Acronym" w:semiHidden="1" w:unhideWhenUsed="1"/>
-    <w:lsdException w:name="HTML Address" w:semiHidden="1" w:unhideWhenUsed="1"/>
-    <w:lsdException w:name="HTML Cite" w:semiHidden="1" w:unhideWhenUsed="1"/>
-    <w:lsdException w:name="HTML Code" w:semiHidden="1" w:unhideWhenUsed="1"/>
-    <w:lsdException w:name="HTML Definition" w:semiHidden="1" w:unhideWhenUsed="1"/>
-    <w:lsdException w:name="HTML Keyboard" w:semiHidden="1" w:unhideWhenUsed="1"/>
-    <w:lsdException w:name="HTML Preformatted" w:semiHidden="1" w:unhideWhenUsed="1"/>
-    <w:lsdException w:name="HTML Sample" w:semiHidden="1" w:unhideWhenUsed="1"/>
-    <w:lsdException w:name="HTML Typewriter" w:semiHidden="1" w:unhideWhenUsed="1"/>
-    <w:lsdException w:name="HTML Variable" w:semiHidden="1" w:unhideWhenUsed="1"/>
-    <w:lsdException w:name="Normal Table" w:semiHidden="1" w:unhideWhenUsed="1"/>
-    <w:lsdException w:name="annotation subject" w:semiHidden="1" w:unhideWhenUsed="1"/>
-    <w:lsdException w:name="No List" w:semiHidden="1" w:unhideWhenUsed="1"/>
-    <w:lsdException w:name="Outline List 1" w:semiHidden="1" w:unhideWhenUsed="1"/>
-    <w:lsdException w:name="Outline List 2" w:semiHidden="1" w:unhideWhenUsed="1"/>
-    <w:lsdException w:name="Outline List 3" w:semiHidden="1" w:unhideWhenUsed="1"/>
-    <w:lsdException w:name="Table Simple 1" w:semiHidden="1" w:unhideWhenUsed="1"/>
-    <w:lsdException w:name="Table Simple 2" w:semiHidden="1" w:unhideWhenUsed="1"/>
-    <w:lsdException w:name="Table Simple 3" w:semiHidden="1" w:unhideWhenUsed="1"/>
-    <w:lsdException w:name="Table Classic 1" w:semiHidden="1" w:unhideWhenUsed="1"/>
-    <w:lsdException w:name="Table Classic 2" w:semiHidden="1" w:unhideWhenUsed="1"/>
-    <w:lsdException w:name="Table Classic 3" w:semiHidden="1" w:unhideWhenUsed="1"/>
-    <w:lsdException w:name="Table Classic 4" w:semiHidden="1" w:unhideWhenUsed="1"/>
-    <w:lsdException w:name="Table Colorful 1" w:semiHidden="1" w:unhideWhenUsed="1"/>
-    <w:lsdException w:name="Table Colorful 2" w:semiHidden="1" w:unhideWhenUsed="1"/>
-    <w:lsdException w:name="Table Colorful 3" w:semiHidden="1" w:unhideWhenUsed="1"/>
-    <w:lsdException w:name="Table Columns 1" w:semiHidden="1" w:unhideWhenUsed="1"/>
-    <w:lsdException w:name="Table Columns 2" w:semiHidden="1" w:unhideWhenUsed="1"/>
-    <w:lsdException w:name="Table Columns 3" w:semiHidden="1" w:unhideWhenUsed="1"/>
-    <w:lsdException w:name="Table Columns 4" w:semiHidden="1" w:unhideWhenUsed="1"/>
-    <w:lsdException w:name="Table Columns 5" w:semiHidden="1" w:unhideWhenUsed="1"/>
-    <w:lsdException w:name="Table Grid 1" w:semiHidden="1" w:unhideWhenUsed="1"/>
-    <w:lsdException w:name="Table Grid 2" w:semiHidden="1" w:unhideWhenUsed="1"/>
-    <w:lsdException w:name="Table Grid 3" w:semiHidden="1" w:unhideWhenUsed="1"/>
-    <w:lsdException w:name="Table Grid 4" w:semiHidden="1" w:unhideWhenUsed="1"/>
-    <w:lsdException w:name="Table Grid 5" w:semiHidden="1" w:unhideWhenUsed="1"/>
-    <w:lsdException w:name="Table Grid 6" w:semiHidden="1" w:unhideWhenUsed="1"/>
-    <w:lsdException w:name="Table Grid 7" w:semiHidden="1" w:unhideWhenUsed="1"/>
-    <w:lsdException w:name="Table Grid 8" w:semiHidden="1" w:unhideWhenUsed="1"/>
-    <w:lsdException w:name="Table List 1" w:semiHidden="1" w:unhideWhenUsed="1"/>
-    <w:lsdException w:name="Table List 2" w:semiHidden="1" w:unhideWhenUsed="1"/>
-    <w:lsdException w:name="Table List 3" w:semiHidden="1" w:unhideWhenUsed="1"/>
-    <w:lsdException w:name="Table List 4" w:semiHidden="1" w:unhideWhenUsed="1"/>
-    <w:lsdException w:name="Table List 5" w:semiHidden="1" w:unhideWhenUsed="1"/>
-    <w:lsdException w:name="Table List 6" w:semiHidden="1" w:unhideWhenUsed="1"/>
-    <w:lsdException w:name="Table List 7" w:semiHidden="1" w:unhideWhenUsed="1"/>
-    <w:lsdException w:name="Table List 8" w:semiHidden="1" w:unhideWhenUsed="1"/>
-    <w:lsdException w:name="Table 3D effects 1" w:semiHidden="1" w:unhideWhenUsed="1"/>
-    <w:lsdException w:name="Table 3D effects 2" w:semiHidden="1" w:unhideWhenUsed="1"/>
-    <w:lsdException w:name="Table 3D effects 3" w:semiHidden="1" w:unhideWhenUsed="1"/>
-    <w:lsdException w:name="Table Contemporary" w:semiHidden="1" w:unhideWhenUsed="1"/>
-    <w:lsdException w:name="Table Elegant" w:semiHidden="1" w:unhideWhenUsed="1"/>
-    <w:lsdException w:name="Table Professional" w:semiHidden="1" w:unhideWhenUsed="1"/>
-    <w:lsdException w:name="Table Subtle 1" w:semiHidden="1" w:unhideWhenUsed="1"/>
-    <w:lsdException w:name="Table Subtle 2" w:semiHidden="1" w:unhideWhenUsed="1"/>
-    <w:lsdException w:name="Table Web 1" w:semiHidden="1" w:unhideWhenUsed="1"/>
-    <w:lsdException w:name="Table Web 2" w:semiHidden="1" w:unhideWhenUsed="1"/>
-    <w:lsdException w:name="Table Web 3" w:semiHidden="1" w:unhideWhenUsed="1"/>
-    <w:lsdException w:name="Balloon Text" w:semiHidden="1" w:unhideWhenUsed="1"/>
-    <w:lsdException w:name="Table Grid" w:uiPriority="39"/>
-    <w:lsdException w:name="Table Theme" w:semiHidden="1" w:unhideWhenUsed="1"/>
-    <w:lsdException w:name="Placeholder Text" w:semiHidden="1"/>
-    <w:lsdException w:name="No Spacing" w:uiPriority="1" w:qFormat="1"/>
-    <w:lsdException w:name="Light Shading" w:uiPriority="60"/>
-    <w:lsdException w:name="Light List" w:uiPriority="61"/>
-    <w:lsdException w:name="Light Grid" w:uiPriority="62"/>
-    <w:lsdException w:name="Medium Shading 1" w:uiPriority="63"/>
-    <w:lsdException w:name="Medium Shading 2" w:uiPriority="64"/>
-    <w:lsdException w:name="Medium List 1" w:uiPriority="65"/>
-    <w:lsdException w:name="Medium List 2" w:uiPriority="66"/>
-    <w:lsdException w:name="Medium Grid 1" w:uiPriority="67"/>
-    <w:lsdException w:name="Medium Grid 2" w:uiPriority="68"/>
-    <w:lsdException w:name="Medium Grid 3" w:uiPriority="69"/>
-    <w:lsdException w:name="Dark List" w:uiPriority="70"/>
-    <w:lsdException w:name="Colorful Shading" w:uiPriority="71"/>
-    <w:lsdException w:name="Colorful List" w:uiPriority="72"/>
-    <w:lsdException w:name="Colorful Grid" w:uiPriority="73"/>
-    <w:lsdException w:name="Light Shading Accent 1" w:uiPriority="60"/>
-    <w:lsdException w:name="Light List Accent 1" w:uiPriority="61"/>
-    <w:lsdException w:name="Light Grid Accent 1" w:uiPriority="62"/>
-    <w:lsdException w:name="Medium Shading 1 Accent 1" w:uiPriority="63"/>
-    <w:lsdException w:name="Medium Shading 2 Accent 1" w:uiPriority="64"/>
-    <w:lsdException w:name="Medium List 1 Accent 1" w:uiPriority="65"/>
-    <w:lsdException w:name="Revision" w:semiHidden="1"/>
-    <w:lsdException w:name="List Paragraph" w:uiPriority="34" w:qFormat="1"/>
-    <w:lsdException w:name="Quote" w:uiPriority="29" w:qFormat="1"/>
-    <w:lsdException w:name="Intense Quote" w:uiPriority="30" w:qFormat="1"/>
-    <w:lsdException w:name="Medium List 2 Accent 1" w:uiPriority="66"/>
-    <w:lsdException w:name="Medium Grid 1 Accent 1" w:uiPriority="67"/>
-    <w:lsdException w:name="Medium Grid 2 Accent 1" w:uiPriority="68"/>
-    <w:lsdException w:name="Medium Grid 3 Accent 1" w:uiPriority="69"/>
-    <w:lsdException w:name="Dark List Accent 1" w:uiPriority="70"/>
-    <w:lsdException w:name="Colorful Shading Accent 1" w:uiPriority="71"/>
-    <w:lsdException w:name="Colorful List Accent 1" w:uiPriority="72"/>
-    <w:lsdException w:name="Colorful Grid Accent 1" w:uiPriority="73"/>
-    <w:lsdException w:name="Light Shading Accent 2" w:uiPriority="60"/>
-    <w:lsdException w:name="Light List Accent 2" w:uiPriority="61"/>
-    <w:lsdException w:name="Light Grid Accent 2" w:uiPriority="62"/>
-    <w:lsdException w:name="Medium Shading 1 Accent 2" w:uiPriority="63"/>
-    <w:lsdException w:name="Medium Shading 2 Accent 2" w:uiPriority="64"/>
-    <w:lsdException w:name="Medium List 1 Accent 2" w:uiPriority="65"/>
-    <w:lsdException w:name="Medium List 2 Accent 2" w:uiPriority="66"/>
-    <w:lsdException w:name="Medium Grid 1 Accent 2" w:uiPriority="67"/>
-    <w:lsdException w:name="Medium Grid 2 Accent 2" w:uiPriority="68"/>
-    <w:lsdException w:name="Medium Grid 3 Accent 2" w:uiPriority="69"/>
-    <w:lsdException w:name="Dark List Accent 2" w:uiPriority="70"/>
-    <w:lsdException w:name="Colorful Shading Accent 2" w:uiPriority="71"/>
-    <w:lsdException w:name="Colorful List Accent 2" w:uiPriority="72"/>
-    <w:lsdException w:name="Colorful Grid Accent 2" w:uiPriority="73"/>
-    <w:lsdException w:name="Light Shading Accent 3" w:uiPriority="60"/>
-    <w:lsdException w:name="Light List Accent 3" w:uiPriority="61"/>
-    <w:lsdException w:name="Light Grid Accent 3" w:uiPriority="62"/>
-    <w:lsdException w:name="Medium Shading 1 Accent 3" w:uiPriority="63"/>
-    <w:lsdException w:name="Medium Shading 2 Accent 3" w:uiPriority="64"/>
-    <w:lsdException w:name="Medium List 1 Accent 3" w:uiPriority="65"/>
-    <w:lsdException w:name="Medium List 2 Accent 3" w:uiPriority="66"/>
-    <w:lsdException w:name="Medium Grid 1 Accent 3" w:uiPriority="67"/>
-    <w:lsdException w:name="Medium Grid 2 Accent 3" w:uiPriority="68"/>
-    <w:lsdException w:name="Medium Grid 3 Accent 3" w:uiPriority="69"/>
-    <w:lsdException w:name="Dark List Accent 3" w:uiPriority="70"/>
-    <w:lsdException w:name="Colorful Shading Accent 3" w:uiPriority="71"/>
-    <w:lsdException w:name="Colorful List Accent 3" w:uiPriority="72"/>
-    <w:lsdException w:name="Colorful Grid Accent 3" w:uiPriority="73"/>
-    <w:lsdException w:name="Light Shading Accent 4" w:uiPriority="60"/>
-    <w:lsdException w:name="Light List Accent 4" w:uiPriority="61"/>
-    <w:lsdException w:name="Light Grid Accent 4" w:uiPriority="62"/>
-    <w:lsdException w:name="Medium Shading 1 Accent 4" w:uiPriority="63"/>
-    <w:lsdException w:name="Medium Shading 2 Accent 4" w:uiPriority="64"/>
-    <w:lsdException w:name="Medium List 1 Accent 4" w:uiPriority="65"/>
-    <w:lsdException w:name="Medium List 2 Accent 4" w:uiPriority="66"/>
-    <w:lsdException w:name="Medium Grid 1 Accent 4" w:uiPriority="67"/>
-    <w:lsdException w:name="Medium Grid 2 Accent 4" w:uiPriority="68"/>
-    <w:lsdException w:name="Medium Grid 3 Accent 4" w:uiPriority="69"/>
-    <w:lsdException w:name="Dark List Accent 4" w:uiPriority="70"/>
-    <w:lsdException w:name="Colorful Shading Accent 4" w:uiPriority="71"/>
-    <w:lsdException w:name="Colorful List Accent 4" w:uiPriority="72"/>
-    <w:lsdException w:name="Colorful Grid Accent 4" w:uiPriority="73"/>
-    <w:lsdException w:name="Light Shading Accent 5" w:uiPriority="60"/>
-    <w:lsdException w:name="Light List Accent 5" w:uiPriority="61"/>
-    <w:lsdException w:name="Light Grid Accent 5" w:uiPriority="62"/>
-    <w:lsdException w:name="Medium Shading 1 Accent 5" w:uiPriority="63"/>
-    <w:lsdException w:name="Medium Shading 2 Accent 5" w:uiPriority="64"/>
-    <w:lsdException w:name="Medium List 1 Accent 5" w:uiPriority="65"/>
-    <w:lsdException w:name="Medium List 2 Accent 5" w:uiPriority="66"/>
-    <w:lsdException w:name="Medium Grid 1 Accent 5" w:uiPriority="67"/>
-    <w:lsdException w:name="Medium Grid 2 Accent 5" w:uiPriority="68"/>
-    <w:lsdException w:name="Medium Grid 3 Accent 5" w:uiPriority="69"/>
-    <w:lsdException w:name="Dark List Accent 5" w:uiPriority="70"/>
-    <w:lsdException w:name="Colorful Shading Accent 5" w:uiPriority="71"/>
-    <w:lsdException w:name="Colorful List Accent 5" w:uiPriority="72"/>
-    <w:lsdException w:name="Colorful Grid Accent 5" w:uiPriority="73"/>
-    <w:lsdException w:name="Light Shading Accent 6" w:uiPriority="60"/>
-    <w:lsdException w:name="Light List Accent 6" w:uiPriority="61"/>
-    <w:lsdException w:name="Light Grid Accent 6" w:uiPriority="62"/>
-    <w:lsdException w:name="Medium Shading 1 Accent 6" w:uiPriority="63"/>
-    <w:lsdException w:name="Medium Shading 2 Accent 6" w:uiPriority="64"/>
-    <w:lsdException w:name="Medium List 1 Accent 6" w:uiPriority="65"/>
-    <w:lsdException w:name="Medium List 2 Accent 6" w:uiPriority="66"/>
-    <w:lsdException w:name="Medium Grid 1 Accent 6" w:uiPriority="67"/>
-    <w:lsdException w:name="Medium Grid 2 Accent 6" w:uiPriority="68"/>
-    <w:lsdException w:name="Medium Grid 3 Accent 6" w:uiPriority="69"/>
-    <w:lsdException w:name="Dark List Accent 6" w:uiPriority="70"/>
-    <w:lsdException w:name="Colorful Shading Accent 6" w:uiPriority="71"/>
-    <w:lsdException w:name="Colorful List Accent 6" w:uiPriority="72"/>
-    <w:lsdException w:name="Colorful Grid Accent 6" w:uiPriority="73"/>
-    <w:lsdException w:name="Subtle Emphasis" w:uiPriority="19" w:qFormat="1"/>
-    <w:lsdException w:name="Intense Emphasis" w:uiPriority="21" w:qFormat="1"/>
-    <w:lsdException w:name="Subtle Reference" w:uiPriority="31" w:qFormat="1"/>
-    <w:lsdException w:name="Intense Reference" w:uiPriority="32" w:qFormat="1"/>
-    <w:lsdException w:name="Book Title" w:uiPriority="33" w:qFormat="1"/>
-    <w:lsdException w:name="Bibliography" w:semiHidden="1" w:uiPriority="37" w:unhideWhenUsed="1"/>
-    <w:lsdException w:name="TOC Heading" w:semiHidden="1" w:uiPriority="39" w:unhideWhenUsed="1" w:qFormat="1"/>
-    <w:lsdException w:name="Plain Table 1" w:uiPriority="41"/>
-    <w:lsdException w:name="Plain Table 2" w:uiPriority="42"/>
-    <w:lsdException w:name="Plain Table 3" w:uiPriority="43"/>
-    <w:lsdException w:name="Plain Table 4" w:uiPriority="44"/>
-    <w:lsdException w:name="Plain Table 5" w:uiPriority="45"/>
-    <w:lsdException w:name="Grid Table Light" w:uiPriority="40"/>
-    <w:lsdException w:name="Grid Table 1 Light" w:uiPriority="46"/>
-    <w:lsdException w:name="Grid Table 2" w:uiPriority="47"/>
-    <w:lsdException w:name="Grid Table 3" w:uiPriority="48"/>
-    <w:lsdException w:name="Grid Table 4" w:uiPriority="49"/>
-    <w:lsdException w:name="Grid Table 5 Dark" w:uiPriority="50"/>
-    <w:lsdException w:name="Grid Table 6 Colorful" w:uiPriority="51"/>
-    <w:lsdException w:name="Grid Table 7 Colorful" w:uiPriority="52"/>
-    <w:lsdException w:name="Grid Table 1 Light Accent 1" w:uiPriority="46"/>
-    <w:lsdException w:name="Grid Table 2 Accent 1" w:uiPriority="47"/>
-    <w:lsdException w:name="Grid Table 3 Accent 1" w:uiPriority="48"/>
-    <w:lsdException w:name="Grid Table 4 Accent 1" w:uiPriority="49"/>
-    <w:lsdException w:name="Grid Table 5 Dark Accent 1" w:uiPriority="50"/>
-    <w:lsdException w:name="Grid Table 6 Colorful Accent 1" w:uiPriority="51"/>
-    <w:lsdException w:name="Grid Table 7 Colorful Accent 1" w:uiPriority="52"/>
-    <w:lsdException w:name="Grid Table 1 Light Accent 2" w:uiPriority="46"/>
-    <w:lsdException w:name="Grid Table 2 Accent 2" w:uiPriority="47"/>
-    <w:lsdException w:name="Grid Table 3 Accent 2" w:uiPriority="48"/>
-    <w:lsdException w:name="Grid Table 4 Accent 2" w:uiPriority="49"/>
-    <w:lsdException w:name="Grid Table 5 Dark Accent 2" w:uiPriority="50"/>
-    <w:lsdException w:name="Grid Table 6 Colorful Accent 2" w:uiPriority="51"/>
-    <w:lsdException w:name="Grid Table 7 Colorful Accent 2" w:uiPriority="52"/>
-    <w:lsdException w:name="Grid Table 1 Light Accent 3" w:uiPriority="46"/>
-    <w:lsdException w:name="Grid Table 2 Accent 3" w:uiPriority="47"/>
-    <w:lsdException w:name="Grid Table 3 Accent 3" w:uiPriority="48"/>
-    <w:lsdException w:name="Grid Table 4 Accent 3" w:uiPriority="49"/>
-    <w:lsdException w:name="Grid Table 5 Dark Accent 3" w:uiPriority="50"/>
-    <w:lsdException w:name="Grid Table 6 Colorful Accent 3" w:uiPriority="51"/>
-    <w:lsdException w:name="Grid Table 7 Colorful Accent 3" w:uiPriority="52"/>
-    <w:lsdException w:name="Grid Table 1 Light Accent 4" w:uiPriority="46"/>
-    <w:lsdException w:name="Grid Table 2 Accent 4" w:uiPriority="47"/>
-    <w:lsdException w:name="Grid Table 3 Accent 4" w:uiPriority="48"/>
-    <w:lsdException w:name="Grid Table 4 Accent 4" w:uiPriority="49"/>
-    <w:lsdException w:name="Grid Table 5 Dark Accent 4" w:uiPriority="50"/>
-    <w:lsdException w:name="Grid Table 6 Colorful Accent 4" w:uiPriority="51"/>
-    <w:lsdException w:name="Grid Table 7 Colorful Accent 4" w:uiPriority="52"/>
-    <w:lsdException w:name="Grid Table 1 Light Accent 5" w:uiPriority="46"/>
-    <w:lsdException w:name="Grid Table 2 Accent 5" w:uiPriority="47"/>
-    <w:lsdException w:name="Grid Table 3 Accent 5" w:uiPriority="48"/>
-    <w:lsdException w:name="Grid Table 4 Accent 5" w:uiPriority="49"/>
-    <w:lsdException w:name="Grid Table 5 Dark Accent 5" w:uiPriority="50"/>
-    <w:lsdException w:name="Grid Table 6 Colorful Accent 5" w:uiPriority="51"/>
-    <w:lsdException w:name="Grid Table 7 Colorful Accent 5" w:uiPriority="52"/>
-    <w:lsdException w:name="Grid Table 1 Light Accent 6" w:uiPriority="46"/>
-    <w:lsdException w:name="Grid Table 2 Accent 6" w:uiPriority="47"/>
-    <w:lsdException w:name="Grid Table 3 Accent 6" w:uiPriority="48"/>
-    <w:lsdException w:name="Grid Table 4 Accent 6" w:uiPriority="49"/>
-    <w:lsdException w:name="Grid Table 5 Dark Accent 6" w:uiPriority="50"/>
-    <w:lsdException w:name="Grid Table 6 Colorful Accent 6" w:uiPriority="51"/>
-    <w:lsdException w:name="Grid Table 7 Colorful Accent 6" w:uiPriority="52"/>
-    <w:lsdException w:name="List Table 1 Light" w:uiPriority="46"/>
-    <w:lsdException w:name="List Table 2" w:uiPriority="47"/>
-    <w:lsdException w:name="List Table 3" w:uiPriority="48"/>
-    <w:lsdException w:name="List Table 4" w:uiPriority="49"/>
-    <w:lsdException w:name="List Table 5 Dark" w:uiPriority="50"/>
-    <w:lsdException w:name="List Table 6 Colorful" w:uiPriority="51"/>
-    <w:lsdException w:name="List Table 7 Colorful" w:uiPriority="52"/>
-    <w:lsdException w:name="List Table 1 Light Accent 1" w:uiPriority="46"/>
-    <w:lsdException w:name="List Table 2 Accent 1" w:uiPriority="47"/>
-    <w:lsdException w:name="List Table 3 Accent 1" w:uiPriority="48"/>
-    <w:lsdException w:name="List Table 4 Accent 1" w:uiPriority="49"/>
-    <w:lsdException w:name="List Table 5 Dark Accent 1" w:uiPriority="50"/>
-    <w:lsdException w:name="List Table 6 Colorful Accent 1" w:uiPriority="51"/>
-    <w:lsdException w:name="List Table 7 Colorful Accent 1" w:uiPriority="52"/>
-    <w:lsdException w:name="List Table 1 Light Accent 2" w:uiPriority="46"/>
-    <w:lsdException w:name="List Table 2 Accent 2" w:uiPriority="47"/>
-    <w:lsdException w:name="List Table 3 Accent 2" w:uiPriority="48"/>
-    <w:lsdException w:name="List Table 4 Accent 2" w:uiPriority="49"/>
-    <w:lsdException w:name="List Table 5 Dark Accent 2" w:uiPriority="50"/>
-    <w:lsdException w:name="List Table 6 Colorful Accent 2" w:uiPriority="51"/>
-    <w:lsdException w:name="List Table 7 Colorful Accent 2" w:uiPriority="52"/>
-    <w:lsdException w:name="List Table 1 Light Accent 3" w:uiPriority="46"/>
-    <w:lsdException w:name="List Table 2 Accent 3" w:uiPriority="47"/>
-    <w:lsdException w:name="List Table 3 Accent 3" w:uiPriority="48"/>
-    <w:lsdException w:name="List Table 4 Accent 3" w:uiPriority="49"/>
-    <w:lsdException w:name="List Table 5 Dark Accent 3" w:uiPriority="50"/>
-    <w:lsdException w:name="List Table 6 Colorful Accent 3" w:uiPriority="51"/>
-    <w:lsdException w:name="List Table 7 Colorful Accent 3" w:uiPriority="52"/>
-    <w:lsdException w:name="List Table 1 Light Accent 4" w:uiPriority="46"/>
-    <w:lsdException w:name="List Table 2 Accent 4" w:uiPriority="47"/>
-    <w:lsdException w:name="List Table 3 Accent 4" w:uiPriority="48"/>
-    <w:lsdException w:name="List Table 4 Accent 4" w:uiPriority="49"/>
-    <w:lsdException w:name="List Table 5 Dark Accent 4" w:uiPriority="50"/>
-    <w:lsdException w:name="List Table 6 Colorful Accent 4" w:uiPriority="51"/>
-    <w:lsdException w:name="List Table 7 Colorful Accent 4" w:uiPriority="52"/>
-    <w:lsdException w:name="List Table 1 Light Accent 5" w:uiPriority="46"/>
-    <w:lsdException w:name="List Table 2 Accent 5" w:uiPriority="47"/>
-    <w:lsdException w:name="List Table 3 Accent 5" w:uiPriority="48"/>
-    <w:lsdException w:name="List Table 4 Accent 5" w:uiPriority="49"/>
-    <w:lsdException w:name="List Table 5 Dark Accent 5" w:uiPriority="50"/>
-    <w:lsdException w:name="List Table 6 Colorful Accent 5" w:uiPriority="51"/>
-    <w:lsdException w:name="List Table 7 Colorful Accent 5" w:uiPriority="52"/>
-    <w:lsdException w:name="List Table 1 Light Accent 6" w:uiPriority="46"/>
-    <w:lsdException w:name="List Table 2 Accent 6" w:uiPriority="47"/>
-    <w:lsdException w:name="List Table 3 Accent 6" w:uiPriority="48"/>
-    <w:lsdException w:name="List Table 4 Accent 6" w:uiPriority="49"/>
-    <w:lsdException w:name="List Table 5 Dark Accent 6" w:uiPriority="50"/>
-    <w:lsdException w:name="List Table 6 Colorful Accent 6" w:uiPriority="51"/>
-    <w:lsdException w:name="List Table 7 Colorful Accent 6" w:uiPriority="52"/>
-  </w:latentStyles>
-  <w:style w:type="paragraph" w:default="1" w:styleId="Normal">
-    <w:name w:val="Normal"/>
-    <w:qFormat/>
-  </w:style>
-  <w:style w:type="character" w:default="1" w:styleId="Fuentedeprrafopredeter">
-    <w:name w:val="Default Paragraph Font"/>
-    <w:uiPriority w:val="1"/>
-    <w:semiHidden/>
-    <w:unhideWhenUsed/>
-  </w:style>
-  <w:style w:type="table" w:default="1" w:styleId="Tablanormal">
-    <w:name w:val="Normal Table"/>
-    <w:uiPriority w:val="99"/>
-    <w:semiHidden/>
-    <w:unhideWhenUsed/>
-    <w:tblPr>
-      <w:tblInd w:w="0" w:type="dxa"/>
-      <w:tblCellMar>
-        <w:top w:w="0" w:type="dxa"/>
-        <w:left w:w="108" w:type="dxa"/>
-        <w:bottom w:w="0" w:type="dxa"/>
-        <w:right w:w="108" w:type="dxa"/>
-      </w:tblCellMar>
-    </w:tblPr>
-  </w:style>
-  <w:style w:type="numbering" w:default="1" w:styleId="Sinlista">
-    <w:name w:val="No List"/>
-    <w:uiPriority w:val="99"/>
-    <w:semiHidden/>
-    <w:unhideWhenUsed/>
-  </w:style>
-</w:styles>
-</file>
-
-<file path=word/glossary/webSettings.xml><?xml version="1.0" encoding="utf-8"?>
-<w:webSettings xmlns:mc="http://schemas.openxmlformats.org/markup-compatibility/2006" xmlns:r="http://schemas.openxmlformats.org/officeDocument/2006/relationships" xmlns:w="http://schemas.openxmlformats.org/wordprocessingml/2006/main" xmlns:w14="http://schemas.microsoft.com/office/word/2010/wordml" xmlns:w15="http://schemas.microsoft.com/office/word/2012/wordml" xmlns:w16se="http://schemas.microsoft.com/office/word/2015/wordml/symex" mc:Ignorable="w14 w15 w16se"/>
 </file>
 
 <file path=word/theme/theme1.xml><?xml version="1.0" encoding="utf-8"?>
@@ -9000,6 +8530,12 @@
 </file>
 
 <file path=customXml/item1.xml><?xml version="1.0" encoding="utf-8"?>
+<p:properties xmlns:p="http://schemas.microsoft.com/office/2006/metadata/properties" xmlns:xsi="http://www.w3.org/2001/XMLSchema-instance" xmlns:pc="http://schemas.microsoft.com/office/infopath/2007/PartnerControls">
+  <documentManagement/>
+</p:properties>
+</file>
+
+<file path=customXml/item2.xml><?xml version="1.0" encoding="utf-8"?>
 <ct:contentTypeSchema xmlns:ct="http://schemas.microsoft.com/office/2006/metadata/contentType" xmlns:ma="http://schemas.microsoft.com/office/2006/metadata/properties/metaAttributes" ct:_="" ma:_="" ma:contentTypeName="Documento" ma:contentTypeID="0x010100E96778489EE7714D8BD12CC105EB918B" ma:contentTypeVersion="2" ma:contentTypeDescription="Crear nuevo documento." ma:contentTypeScope="" ma:versionID="416c5c7ae9b5d54d83875cd3c65194e3">
   <xsd:schema xmlns:xsd="http://www.w3.org/2001/XMLSchema" xmlns:xs="http://www.w3.org/2001/XMLSchema" xmlns:p="http://schemas.microsoft.com/office/2006/metadata/properties" xmlns:ns2="126e8a1c-9ea9-435a-ac89-d06c80d62e30" targetNamespace="http://schemas.microsoft.com/office/2006/metadata/properties" ma:root="true" ma:fieldsID="70a237c842677bd850644f8595079f5e" ns2:_="">
     <xsd:import namespace="126e8a1c-9ea9-435a-ac89-d06c80d62e30"/>
@@ -9131,13 +8667,11 @@
 </ct:contentTypeSchema>
 </file>
 
-<file path=customXml/item2.xml><?xml version="1.0" encoding="utf-8"?>
-<p:properties xmlns:p="http://schemas.microsoft.com/office/2006/metadata/properties" xmlns:xsi="http://www.w3.org/2001/XMLSchema-instance" xmlns:pc="http://schemas.microsoft.com/office/infopath/2007/PartnerControls">
-  <documentManagement/>
-</p:properties>
+<file path=customXml/item3.xml><?xml version="1.0" encoding="utf-8"?>
+<b:Sources xmlns:b="http://schemas.openxmlformats.org/officeDocument/2006/bibliography" xmlns="http://schemas.openxmlformats.org/officeDocument/2006/bibliography" SelectedStyle="\APASixthEditionOfficeOnline.xsl" StyleName="APA" Version="6"/>
 </file>
 
-<file path=customXml/item3.xml><?xml version="1.0" encoding="utf-8"?>
+<file path=customXml/item4.xml><?xml version="1.0" encoding="utf-8"?>
 <?mso-contentType ?>
 <FormTemplates xmlns="http://schemas.microsoft.com/sharepoint/v3/contenttype/forms">
   <Display>DocumentLibraryForm</Display>
@@ -9146,11 +8680,16 @@
 </FormTemplates>
 </file>
 
-<file path=customXml/item4.xml><?xml version="1.0" encoding="utf-8"?>
-<b:Sources xmlns:b="http://schemas.openxmlformats.org/officeDocument/2006/bibliography" xmlns="http://schemas.openxmlformats.org/officeDocument/2006/bibliography" SelectedStyle="\APASixthEditionOfficeOnline.xsl" StyleName="APA" Version="6"/>
+<file path=customXml/itemProps1.xml><?xml version="1.0" encoding="utf-8"?>
+<ds:datastoreItem xmlns:ds="http://schemas.openxmlformats.org/officeDocument/2006/customXml" ds:itemID="{5F1783E3-BA1C-4CA3-8E32-C9B378BBED03}">
+  <ds:schemaRefs>
+    <ds:schemaRef ds:uri="http://schemas.microsoft.com/office/2006/metadata/properties"/>
+    <ds:schemaRef ds:uri="http://schemas.microsoft.com/office/infopath/2007/PartnerControls"/>
+  </ds:schemaRefs>
+</ds:datastoreItem>
 </file>
 
-<file path=customXml/itemProps1.xml><?xml version="1.0" encoding="utf-8"?>
+<file path=customXml/itemProps2.xml><?xml version="1.0" encoding="utf-8"?>
 <ds:datastoreItem xmlns:ds="http://schemas.openxmlformats.org/officeDocument/2006/customXml" ds:itemID="{DF0582E6-0C2C-40A6-8E3D-E410E41021C1}">
   <ds:schemaRefs>
     <ds:schemaRef ds:uri="http://schemas.microsoft.com/office/2006/metadata/contentType"/>
@@ -9168,34 +8707,18 @@
 </ds:datastoreItem>
 </file>
 
-<file path=customXml/itemProps2.xml><?xml version="1.0" encoding="utf-8"?>
-<ds:datastoreItem xmlns:ds="http://schemas.openxmlformats.org/officeDocument/2006/customXml" ds:itemID="{5F1783E3-BA1C-4CA3-8E32-C9B378BBED03}">
+<file path=customXml/itemProps3.xml><?xml version="1.0" encoding="utf-8"?>
+<ds:datastoreItem xmlns:ds="http://schemas.openxmlformats.org/officeDocument/2006/customXml" ds:itemID="{FBD61725-A60E-40F3-AB5D-0E7F797DD77D}">
   <ds:schemaRefs>
-    <ds:schemaRef ds:uri="http://schemas.openxmlformats.org/package/2006/metadata/core-properties"/>
-    <ds:schemaRef ds:uri="http://schemas.microsoft.com/office/infopath/2007/PartnerControls"/>
-    <ds:schemaRef ds:uri="http://purl.org/dc/elements/1.1/"/>
-    <ds:schemaRef ds:uri="http://schemas.microsoft.com/office/2006/documentManagement/types"/>
-    <ds:schemaRef ds:uri="http://schemas.microsoft.com/office/2006/metadata/properties"/>
-    <ds:schemaRef ds:uri="126e8a1c-9ea9-435a-ac89-d06c80d62e30"/>
-    <ds:schemaRef ds:uri="http://purl.org/dc/terms/"/>
-    <ds:schemaRef ds:uri="http://purl.org/dc/dcmitype/"/>
-    <ds:schemaRef ds:uri="http://www.w3.org/XML/1998/namespace"/>
+    <ds:schemaRef ds:uri="http://schemas.openxmlformats.org/officeDocument/2006/bibliography"/>
   </ds:schemaRefs>
 </ds:datastoreItem>
 </file>
 
-<file path=customXml/itemProps3.xml><?xml version="1.0" encoding="utf-8"?>
+<file path=customXml/itemProps4.xml><?xml version="1.0" encoding="utf-8"?>
 <ds:datastoreItem xmlns:ds="http://schemas.openxmlformats.org/officeDocument/2006/customXml" ds:itemID="{DABAA964-10BA-4DBC-ABF2-CDEAC0FAF7AA}">
   <ds:schemaRefs>
     <ds:schemaRef ds:uri="http://schemas.microsoft.com/sharepoint/v3/contenttype/forms"/>
   </ds:schemaRefs>
 </ds:datastoreItem>
-</file>
-
-<file path=customXml/itemProps4.xml><?xml version="1.0" encoding="utf-8"?>
-<ds:datastoreItem xmlns:ds="http://schemas.openxmlformats.org/officeDocument/2006/customXml" ds:itemID="{FBD61725-A60E-40F3-AB5D-0E7F797DD77D}">
-  <ds:schemaRefs>
-    <ds:schemaRef ds:uri="http://schemas.openxmlformats.org/officeDocument/2006/bibliography"/>
-  </ds:schemaRefs>
-</ds:datastoreItem>
 </file>
</xml_diff>